<commit_message>
feat: implement localization, auth, pricing modals, and start_frontend script
</commit_message>
<xml_diff>
--- a/Readme.docx
+++ b/Readme.docx
@@ -29,7 +29,7 @@
           <w:color w:val="6C7086"/>
           <w:sz w:val="26"/>
         </w:rPr>
-        <w:t>Инструкция по запуску локального бэкенда и использованию веб-интерфейса</w:t>
+        <w:t>Инструкция по запуску локального бэкенда, использованию веб-интерфейса и аналитике</w:t>
       </w:r>
     </w:p>
     <w:p>
@@ -37,7 +37,7 @@
         <w:spacing w:after="240" w:line="276" w:lineRule="auto"/>
       </w:pPr>
       <w:r>
-        <w:t>Этот документ содержит подробную пошаговую инструкцию по запуску локальной нейросетевой части системы распознавания шрифтов (HFR) на вашем компьютере и подключению к ней веб-интерфейса, опубликованного на GitHub Pages.</w:t>
+        <w:t>Этот документ содержит подробную пошаговую инструкцию по запуску локальной нейросетевой части системы распознавания шрифтов (HFR) на вашем компьютере, подключению к ней веб-интерфейса и работе с локальной системой сбора статистики (аналитики).</w:t>
       </w:r>
     </w:p>
     <w:p>
@@ -60,7 +60,7 @@
         <w:spacing w:after="240"/>
       </w:pPr>
       <w:r>
-        <w:t>Система состоит из двух независимых частей:</w:t>
+        <w:t>Система состоит из трех ключевых компонентов:</w:t>
       </w:r>
     </w:p>
     <w:p>
@@ -81,7 +81,7 @@
     <w:p>
       <w:pPr>
         <w:pStyle w:val="ListBullet"/>
-        <w:spacing w:after="240"/>
+        <w:spacing w:after="80"/>
       </w:pPr>
       <w:r>
         <w:rPr>
@@ -99,7 +99,22 @@
         <w:t>https://alexmurzai.github.io/CyrillicFontTransfer/</w:t>
       </w:r>
       <w:r>
-        <w:t>. Работает прямо в браузере и отправляет запросы на ваш компьютер через защищенный HTTPS-туннель.</w:t>
+        <w:t>. Работает в браузере и отправляет запросы на ваш компьютер через защищенный HTTPS-туннель.</w:t>
+      </w:r>
+    </w:p>
+    <w:p>
+      <w:pPr>
+        <w:pStyle w:val="ListBullet"/>
+        <w:spacing w:after="240"/>
+      </w:pPr>
+      <w:r>
+        <w:rPr>
+          <w:b/>
+        </w:rPr>
+        <w:t xml:space="preserve">Локальная база аналитики: </w:t>
+      </w:r>
+      <w:r>
+        <w:t>База данных SQLite (data/hfr_stats.db), которая автоматически логирует визиты пользователей, поисковые запросы и скачивания файлов шрифтов.</w:t>
       </w:r>
     </w:p>
     <w:p>
@@ -374,7 +389,7 @@
           <w:color w:val="6C63FF"/>
           <w:sz w:val="36"/>
         </w:rPr>
-        <w:t>3. Инструкция по работе с интерфейсом</w:t>
+        <w:t>3. Инструкция по работе с интерфейсом подбора</w:t>
       </w:r>
     </w:p>
     <w:p>
@@ -382,7 +397,7 @@
         <w:spacing w:after="160"/>
       </w:pPr>
       <w:r>
-        <w:t>Интерфейс веб-приложения разработан по премиум-стандартам и разделен на две логические зоны:</w:t>
+        <w:t>Интерфейс веб-приложения разделен на две логические зоны:</w:t>
       </w:r>
     </w:p>
     <w:p>
@@ -442,7 +457,7 @@
         <w:t xml:space="preserve">✔  Загрузка референса: </w:t>
       </w:r>
       <w:r>
-        <w:t>Вы можете загрузить скриншот с латинским шрифтом тремя способами: перетащив файл мышкой в зону Drag &amp; Drop, выбрав файл на компьютере, либо сделав снимок с веб-камеры.</w:t>
+        <w:t>Вы можете загрузить скриншот с латинским шрифтом тремя способами: перетащив файл в зону Drag &amp; Drop, выбрав файл на компьютере, либо сделав снимок с веб-камеры.</w:t>
       </w:r>
     </w:p>
     <w:p>
@@ -472,7 +487,7 @@
         <w:t xml:space="preserve">✔  Галерея сегментации: </w:t>
       </w:r>
       <w:r>
-        <w:t>После загрузки картинки система выделит отдельные символы с помощью алгоритмов OpenCV (с отступами 30% для сохранения деталей букв) и покажет их в блоке «Сегментация». Это позволяет наглядно убедиться, что нейросеть правильно выделила форму букв.</w:t>
+        <w:t>После загрузки картинки система выделит отдельные символы с помощью OpenCV (с отступами 30% для сохранения деталей букв) и покажет их в блоке «Сегментация». Это позволяет наглядно убедиться, что нейросеть правильно выделила форму букв.</w:t>
       </w:r>
     </w:p>
     <w:p>
@@ -537,7 +552,223 @@
           <w:color w:val="6C63FF"/>
           <w:sz w:val="36"/>
         </w:rPr>
-        <w:t>4. Возможные проблемы и решения</w:t>
+        <w:t>4. Система статистики и аналитики (Дашборд)</w:t>
+      </w:r>
+    </w:p>
+    <w:p>
+      <w:pPr>
+        <w:spacing w:after="160"/>
+      </w:pPr>
+      <w:r>
+        <w:t xml:space="preserve">В проект интегрирована локальная система аналитики. Она полностью автономна и не использует сторонние JS-метрики, что обеспечивает приватность и высокую скорость загрузки. Все данные пишутся в локальную БД SQLite в папке </w:t>
+      </w:r>
+      <w:r>
+        <w:rPr>
+          <w:b/>
+        </w:rPr>
+        <w:t>data/hfr_stats.db</w:t>
+      </w:r>
+      <w:r>
+        <w:t>.</w:t>
+      </w:r>
+    </w:p>
+    <w:p>
+      <w:pPr>
+        <w:pStyle w:val="Heading2"/>
+        <w:keepNext/>
+        <w:spacing w:before="240" w:after="120"/>
+      </w:pPr>
+      <w:r>
+        <w:rPr>
+          <w:rFonts w:ascii="Segoe UI" w:hAnsi="Segoe UI"/>
+          <w:color w:val="45475A"/>
+          <w:sz w:val="28"/>
+        </w:rPr>
+        <w:t>Как просмотреть статистику:</w:t>
+      </w:r>
+    </w:p>
+    <w:p>
+      <w:pPr>
+        <w:spacing w:after="120"/>
+        <w:ind w:left="360"/>
+      </w:pPr>
+      <w:r>
+        <w:rPr>
+          <w:b/>
+        </w:rPr>
+        <w:t xml:space="preserve">Способ A. Консольная утилита (CLI): </w:t>
+      </w:r>
+      <w:r>
+        <w:t xml:space="preserve">Запустите в консоли команду </w:t>
+      </w:r>
+      <w:r>
+        <w:rPr>
+          <w:b/>
+          <w:color w:val="6C63FF"/>
+        </w:rPr>
+        <w:t>py -3 scripts/show_stats.py</w:t>
+      </w:r>
+      <w:r>
+        <w:t>. Она выведет текстовый дашборд с ASCII-графиками активности и таблицами популярных шрифтов прямо в терминал.</w:t>
+      </w:r>
+    </w:p>
+    <w:p>
+      <w:pPr>
+        <w:spacing w:after="240"/>
+        <w:ind w:left="360"/>
+      </w:pPr>
+      <w:r>
+        <w:rPr>
+          <w:b/>
+        </w:rPr>
+        <w:t xml:space="preserve">Способ Б. Интерактивный веб-дашборд: </w:t>
+      </w:r>
+      <w:r>
+        <w:t xml:space="preserve">Перейдите в браузере по адресу </w:t>
+      </w:r>
+      <w:r>
+        <w:rPr>
+          <w:b/>
+          <w:color w:val="6C63FF"/>
+        </w:rPr>
+        <w:t>https://hfr-alex-font.loca.lt/api/stats/dashboard</w:t>
+      </w:r>
+      <w:r>
+        <w:t xml:space="preserve"> (или локально на </w:t>
+      </w:r>
+      <w:r>
+        <w:rPr>
+          <w:b/>
+        </w:rPr>
+        <w:t>http://localhost:8000/api/stats/dashboard</w:t>
+      </w:r>
+      <w:r>
+        <w:t>). Вы увидите стильный современный веб-дашборд с темной темой.</w:t>
+      </w:r>
+    </w:p>
+    <w:p>
+      <w:pPr>
+        <w:pStyle w:val="Heading2"/>
+        <w:keepNext/>
+        <w:spacing w:before="240" w:after="120"/>
+      </w:pPr>
+      <w:r>
+        <w:rPr>
+          <w:rFonts w:ascii="Segoe UI" w:hAnsi="Segoe UI"/>
+          <w:color w:val="45475A"/>
+          <w:sz w:val="28"/>
+        </w:rPr>
+        <w:t>Какие показатели отслеживаются:</w:t>
+      </w:r>
+    </w:p>
+    <w:p>
+      <w:pPr>
+        <w:spacing w:after="120"/>
+        <w:ind w:left="360"/>
+      </w:pPr>
+      <w:r>
+        <w:rPr>
+          <w:b/>
+        </w:rPr>
+        <w:t xml:space="preserve">📈  Уникальные визиты сайта: </w:t>
+      </w:r>
+      <w:r>
+        <w:t>Учитываются визиты по IP-адресам. Реализован интеллектуальный фильтр: повторные заходы или фоновые проверки бэкенда в течение 30 минут с одного IP группируются и не засчитываются как новые визиты.</w:t>
+      </w:r>
+    </w:p>
+    <w:p>
+      <w:pPr>
+        <w:spacing w:after="120"/>
+        <w:ind w:left="360"/>
+      </w:pPr>
+      <w:r>
+        <w:rPr>
+          <w:b/>
+        </w:rPr>
+        <w:t xml:space="preserve">📈  Запущенные подборы шрифтов: </w:t>
+      </w:r>
+      <w:r>
+        <w:t>Фиксируется общее количество проведенных поисков по картинкам, включая информацию о выбранном стилевом фильтре (Serif, Sans, Mono и др.) и самом популярном найденном шрифте.</w:t>
+      </w:r>
+    </w:p>
+    <w:p>
+      <w:pPr>
+        <w:spacing w:after="120"/>
+        <w:ind w:left="360"/>
+      </w:pPr>
+      <w:r>
+        <w:rPr>
+          <w:b/>
+        </w:rPr>
+        <w:t xml:space="preserve">📈  Загрузки шрифтов: </w:t>
+      </w:r>
+      <w:r>
+        <w:t>Логируется количество нажатий на кнопки «Скачать шрифт» с фиксацией ID и имени скачанного файла.</w:t>
+      </w:r>
+    </w:p>
+    <w:p>
+      <w:pPr>
+        <w:spacing w:after="120"/>
+        <w:ind w:left="360"/>
+      </w:pPr>
+      <w:r>
+        <w:rPr>
+          <w:b/>
+        </w:rPr>
+        <w:t xml:space="preserve">📈  Топ-10 популярных совпадений: </w:t>
+      </w:r>
+      <w:r>
+        <w:t>Рейтинг шрифтов, которые чаще всего оказывались на первом месте по результатам распознавания нейросетью.</w:t>
+      </w:r>
+    </w:p>
+    <w:p>
+      <w:pPr>
+        <w:spacing w:after="120"/>
+        <w:ind w:left="360"/>
+      </w:pPr>
+      <w:r>
+        <w:rPr>
+          <w:b/>
+        </w:rPr>
+        <w:t xml:space="preserve">📈  Топ-10 скачиваемых шрифтов: </w:t>
+      </w:r>
+      <w:r>
+        <w:t>Рейтинг шрифтов, которые пользователи чаще всего сохраняли на диск.</w:t>
+      </w:r>
+    </w:p>
+    <w:p>
+      <w:pPr>
+        <w:spacing w:after="120"/>
+        <w:ind w:left="360"/>
+      </w:pPr>
+      <w:r>
+        <w:rPr>
+          <w:b/>
+        </w:rPr>
+        <w:t xml:space="preserve">📈  14-дневный график активности: </w:t>
+      </w:r>
+      <w:r>
+        <w:t>Визуальная столбчатая диаграмма, показывающая соотношение визитов, подборов и скачиваний за последние 2 недели.</w:t>
+      </w:r>
+    </w:p>
+    <w:p>
+      <w:pPr>
+        <w:spacing w:after="240"/>
+      </w:pPr>
+    </w:p>
+    <w:p>
+      <w:pPr>
+        <w:pStyle w:val="Heading1"/>
+        <w:keepNext/>
+        <w:spacing w:before="240" w:after="120"/>
+      </w:pPr>
+      <w:r>
+        <w:rPr>
+          <w:rFonts w:ascii="Segoe UI" w:hAnsi="Segoe UI"/>
+          <w:color w:val="6C63FF"/>
+          <w:sz w:val="36"/>
+        </w:rPr>
+        <w:t>5. Возможные проблемы и решения</w:t>
       </w:r>
     </w:p>
     <w:tbl>

</xml_diff>

<commit_message>
style: update UI to MOCT branding, add new premium fonts, marquee banner, promo block, and script optimizations
</commit_message>
<xml_diff>
--- a/Readme.docx
+++ b/Readme.docx
@@ -14,7 +14,7 @@
           <w:color w:val="6C63FF"/>
           <w:sz w:val="48"/>
         </w:rPr>
-        <w:t>🖋️ HFR — Hierarchical Font Recognition</w:t>
+        <w:t>🖋️ МОСТ — Cyrillic Font Matcher (Интеллектуальный подбор кириллических аналогов)</w:t>
       </w:r>
     </w:p>
     <w:p>
@@ -37,7 +37,7 @@
         <w:spacing w:after="240" w:line="276" w:lineRule="auto"/>
       </w:pPr>
       <w:r>
-        <w:t>Этот документ содержит подробную пошаговую инструкцию по запуску локальной нейросетевой части системы распознавания шрифтов (HFR) на вашем компьютере, подключению к ней веб-интерфейса и работе с локальной системой сбора статистики (аналитики).</w:t>
+        <w:t>Этот документ содержит подробную пошаговую инструкцию по запуску локальной нейросетевой части системы подбора шрифтов (МОСТ) на вашем компьютере, подключению к ней веб-интерфейса и работе с локальной системой сбора статистики (аналитики).</w:t>
       </w:r>
     </w:p>
     <w:p>
@@ -75,7 +75,7 @@
         <w:t xml:space="preserve">Локальный бэкенд (на вашем ПК): </w:t>
       </w:r>
       <w:r>
-        <w:t>FastAPI-сервер, который загружает веса нейросети HFRNet v2.1 на базе EfficientNet-B0 в видеопамять видеокарты NVIDIA RTX 3090 (24 GB VRAM) и производит мгновенный векторный поиск по FAISS-индексу (6231 кириллический шрифт).</w:t>
+        <w:t>FastAPI-сервер, который загружает веса нейросети MOCTNet v2.1 (на базе HFRNet v2.1) на базе EfficientNet-B0 в видеопамять видеокарты NVIDIA RTX 3090 (24 GB VRAM) и производит мгновенный векторный поиск по FAISS-индексу (6231 кириллический шрифт).</w:t>
       </w:r>
     </w:p>
     <w:p>
@@ -373,6 +373,18 @@
       </w:r>
     </w:p>
     <w:p>
+      <w:pPr/>
+      <w:r>
+        <w:rPr>
+          <w:b/>
+        </w:rPr>
+        <w:t xml:space="preserve">•  Оптимизация запуска бэкенда: </w:t>
+      </w:r>
+      <w:r>
+        <w:t>Скрипты запуска автоматически переключаются с команды py -3 на python при отсутствии лаунчера. Внедрена система ожидания (до 30 попыток / 60 секунд) загрузки ML-модели в видеопамять RTX 3090, выводящая текущий прогресс в консоль.</w:t>
+      </w:r>
+    </w:p>
+    <w:p>
       <w:pPr>
         <w:spacing w:after="240"/>
       </w:pPr>
@@ -533,6 +545,54 @@
       </w:r>
       <w:r>
         <w:t>Под каждой карточкой найденного шрифта находится кнопка «Скачать шрифт». Она позволяет в один клик скачать .ttf файл этого шрифта прямо с диска вашего компьютера.</w:t>
+      </w:r>
+    </w:p>
+    <w:p>
+      <w:pPr/>
+      <w:r>
+        <w:rPr>
+          <w:b/>
+        </w:rPr>
+        <w:t xml:space="preserve">✔  Премиальная типографика (стиль Fontfabric): </w:t>
+      </w:r>
+      <w:r>
+        <w:t>Интерфейс адаптирован под визуальные стандарты Fontfabric с использованием крупных контрастных заголовков и гармоничного темного фона. Интегрированы новые шрифты: Calvino Grande Black (для акцентных заголовков), Stratos Light (для основного UI) и Dotum (для вспомогательного текста), а карточки результатов получили увеличенные превью-блоки (высота до 200px) для наглядности букв.</w:t>
+      </w:r>
+    </w:p>
+    <w:p>
+      <w:pPr/>
+      <w:r>
+        <w:rPr>
+          <w:b/>
+        </w:rPr>
+        <w:t xml:space="preserve">✔  Увеличенный лимит попыток: </w:t>
+      </w:r>
+      <w:r>
+        <w:t>Количество бесплатных анонимных подборов на одно устройство увеличено с 2 до 5 (отслеживание по цифровому отпечатку браузера).</w:t>
+      </w:r>
+    </w:p>
+    <w:p>
+      <w:pPr/>
+      <w:r>
+        <w:rPr>
+          <w:b/>
+        </w:rPr>
+        <w:t xml:space="preserve">✔  Промо-блок (Discount Banner): </w:t>
+      </w:r>
+      <w:r>
+        <w:t>В боковую панель встроен стильный блок скидок («ИЮНЬ 50% — Скидка за подписку на 1 год» в виде матовой стеклянной плашки).</w:t>
+      </w:r>
+    </w:p>
+    <w:p>
+      <w:pPr/>
+      <w:r>
+        <w:rPr>
+          <w:b/>
+        </w:rPr>
+        <w:t xml:space="preserve">✔  Бегущая строка (Marquee): </w:t>
+      </w:r>
+      <w:r>
+        <w:t>Сверху страницы добавлена динамическая бегущая строка с ключевым маркетинговым слоганом: «Сэкономьте 5 часов ручного поиска при адаптации вашего бренда на кириллические рынки. Загрузите латиницу — получите идеальное кириллическое соответствие мгновенно».</w:t>
       </w:r>
     </w:p>
     <w:p>

</xml_diff>

<commit_message>
feat: complete UI redesign using Stitch MCP design system - Neon purple glassmorphism palette (primary #c4c0ff, cyan #00dbe9, neon green #39FF14) - Google Fonts: Epilogue, Work Sans, JetBrains Mono - Fixed 320px sidebar with glass backdrop blur - Oversized glass font cards with gradient bar on hover - Fixed header with nav links and footer status bar - Amber promo block, cyan drop zone, sharp glyph boxes - Full RU/EN i18n support preserved with new keys - All functionality preserved: recognition, auth, pricing, API settings
</commit_message>
<xml_diff>
--- a/Readme.docx
+++ b/Readme.docx
@@ -137,7 +137,7 @@
         <w:spacing w:after="160"/>
       </w:pPr>
       <w:r>
-        <w:t>Для того чтобы сайт мог связаться с вашей видеокартой, необходимо запустить сервер и туннель. Для этого в корневой папке проекта подготовлены автоматические скрипты:</w:t>
+        <w:t>Для того чтобы сайт мог связаться с вашей видеокартой, необходимо запустить сервер и туннель. Из-за блокировок протоколов QUIC и сервиса Localtunnel в РФ, рекомендуется использовать стабильный туннель Cloudflare с принудительным обходом через HTTP/2 и IPv4.</w:t>
       </w:r>
     </w:p>
     <w:tbl>
@@ -205,10 +205,7 @@
           </w:tcPr>
           <w:p>
             <w:r>
-              <w:rPr>
-                <w:b/>
-              </w:rPr>
-              <w:t>start_localtunnel.bat (РЕКОМЕНДУЕТСЯ)</w:t>
+              <w:t>start_stable_tunnel.bat (РЕКОМЕНДУЕТСЯ)</w:t>
             </w:r>
           </w:p>
         </w:tc>
@@ -218,7 +215,7 @@
           </w:tcPr>
           <w:p>
             <w:r>
-              <w:t>Localtunnel (https://hfr-alex-font.loca.lt)</w:t>
+              <w:t>Cloudflare Tunnel (HTTP/2)</w:t>
             </w:r>
           </w:p>
         </w:tc>
@@ -228,7 +225,7 @@
           </w:tcPr>
           <w:p>
             <w:r>
-              <w:t>Адрес туннеля постоянный и прописан по умолчанию в коде сайта. Не требует настройки при каждом перезапуске.</w:t>
+              <w:t>Максимально стабилен, обходит блокировки QUIC. Генерирует новый случайный URL (.trycloudflare.com) при каждом запуске.</w:t>
             </w:r>
           </w:p>
         </w:tc>
@@ -240,10 +237,7 @@
           </w:tcPr>
           <w:p>
             <w:r>
-              <w:rPr>
-                <w:b/>
-              </w:rPr>
-              <w:t>start_stable_tunnel.bat</w:t>
+              <w:t>start_server.bat</w:t>
             </w:r>
           </w:p>
         </w:tc>
@@ -253,7 +247,7 @@
           </w:tcPr>
           <w:p>
             <w:r>
-              <w:t>Cloudflare Quick Tunnel (случайный .trycloudflare.com)</w:t>
+              <w:t>Cloudflare Tunnel (HTTP/2)</w:t>
             </w:r>
           </w:p>
         </w:tc>
@@ -263,7 +257,7 @@
           </w:tcPr>
           <w:p>
             <w:r>
-              <w:t>Очень стабилен в плане коннекта, но генерирует новый случайный URL при каждом запуске. Требует ручной вставки адреса на сайте.</w:t>
+              <w:t>То же самое, что и stable_tunnel, запускает бэкенд и туннель.</w:t>
             </w:r>
           </w:p>
         </w:tc>
@@ -275,9 +269,6 @@
           </w:tcPr>
           <w:p>
             <w:r>
-              <w:rPr>
-                <w:b/>
-              </w:rPr>
               <w:t>start_pinggy.bat</w:t>
             </w:r>
           </w:p>
@@ -288,7 +279,7 @@
           </w:tcPr>
           <w:p>
             <w:r>
-              <w:t>Pinggy SSH Tunnel (случайный .pinggy.link)</w:t>
+              <w:t>Pinggy SSH Tunnel (.pinggy.link)</w:t>
             </w:r>
           </w:p>
         </w:tc>
@@ -298,7 +289,39 @@
           </w:tcPr>
           <w:p>
             <w:r>
-              <w:t>Альтернативный резервный канал связи через SSH-туннелирование, если другие сервисы недоступны.</w:t>
+              <w:t>Резервный канал связи через SSH-туннелирование на порт 443.</w:t>
+            </w:r>
+          </w:p>
+        </w:tc>
+      </w:tr>
+      <w:tr>
+        <w:tc>
+          <w:tcPr>
+            <w:tcW w:type="dxa" w:w="3120"/>
+          </w:tcPr>
+          <w:p>
+            <w:r>
+              <w:t>start_localtunnel.bat (НЕ РАБОТАЕТ)</w:t>
+            </w:r>
+          </w:p>
+        </w:tc>
+        <w:tc>
+          <w:tcPr>
+            <w:tcW w:type="dxa" w:w="3120"/>
+          </w:tcPr>
+          <w:p>
+            <w:r>
+              <w:t>Localtunnel (hfr-alex-font-v2.loca.lt)</w:t>
+            </w:r>
+          </w:p>
+        </w:tc>
+        <w:tc>
+          <w:tcPr>
+            <w:tcW w:type="dxa" w:w="3120"/>
+          </w:tcPr>
+          <w:p>
+            <w:r>
+              <w:t>Временно не рекомендуется из-за глубоких блокировок домена loca.lt провайдерами.</w:t>
             </w:r>
           </w:p>
         </w:tc>
@@ -316,12 +339,7 @@
         <w:spacing w:before="240" w:after="120"/>
       </w:pPr>
       <w:r>
-        <w:rPr>
-          <w:rFonts w:ascii="Segoe UI" w:hAnsi="Segoe UI"/>
-          <w:color w:val="45475A"/>
-          <w:sz w:val="28"/>
-        </w:rPr>
-        <w:t>Пошаговый процесс запуска (через Localtunnel):</w:t>
+        <w:t>Пошаговый процесс запуска (через Cloudflare Tunnel):</w:t>
       </w:r>
     </w:p>
     <w:p>
@@ -330,14 +348,7 @@
         <w:ind w:left="360"/>
       </w:pPr>
       <w:r>
-        <w:rPr>
-          <w:b/>
-          <w:color w:val="6C63FF"/>
-        </w:rPr>
-        <w:t xml:space="preserve">•  Шаг 1. Запуск скрипта: </w:t>
-      </w:r>
-      <w:r>
-        <w:t>Дважды кликните по файлу start_localtunnel.bat. Откроется консоль. Скрипт проверит доступность порта 8000, автоматически запустит FastAPI-сервер Uvicorn на вашей видеокарте и поднимет туннель на адресе https://hfr-alex-font.loca.lt.</w:t>
+        <w:t>•  Шаг 1. Запуск скрипта: Дважды кликните по файлу start_stable_tunnel.bat (или start_server.bat). Откроется консоль. Скрипт запустит FastAPI-сервер на видеокарте и поднимет туннель Cloudflare.</w:t>
       </w:r>
     </w:p>
     <w:p>
@@ -346,14 +357,7 @@
         <w:ind w:left="360"/>
       </w:pPr>
       <w:r>
-        <w:rPr>
-          <w:b/>
-          <w:color w:val="6C63FF"/>
-        </w:rPr>
-        <w:t xml:space="preserve">•  Шаг 2. Обход экрана-заглушки (Важно!): </w:t>
-      </w:r>
-      <w:r>
-        <w:t>Localtunnel защищает свои туннели от ботов, поэтому при первом обращении браузер блокирует фоновые запросы. Откройте в новой вкладке браузера адрес https://hfr-alex-font.loca.lt. Вы увидите страницу с запросом IP-адреса. Перейдите на сайт 2ip.ru, скопируйте ваш текущий внешний IP-адрес, вставьте его в поле на странице Localtunnel и нажмите кнопку отправки. Это нужно сделать только ОДИН раз за сессию.</w:t>
+        <w:t>•  Шаг 2. Копирование ссылки: Дождитесь появления в консоли строки с вашей уникальной ссылкой вида https://[случайные-слова].trycloudflare.com. Выделите ее и скопируйте.</w:t>
       </w:r>
     </w:p>
     <w:p>
@@ -362,26 +366,13 @@
         <w:ind w:left="360"/>
       </w:pPr>
       <w:r>
-        <w:rPr>
-          <w:b/>
-          <w:color w:val="6C63FF"/>
-        </w:rPr>
-        <w:t xml:space="preserve">•  Шаг 3. Переход на сайт: </w:t>
-      </w:r>
-      <w:r>
-        <w:t>Откройте сайт https://alexmurzai.github.io/CyrillicFontTransfer/. Подключение произойдет автоматически! В левом нижнем углу загорится зеленый индикатор «Подключено» (будет написано: 6231 шрифтов • cuda).</w:t>
+        <w:t>•  Шаг 3. Подключение сайта: Откройте сайт https://alexmurzai.github.io/CyrillicFontTransfer/. Откройте левую панель настроек (иконка ползунков), найдите поле «URL вашего бэкенда», вставьте туда скопированную ссылку и нажмите «Сохранить». В левом нижнем углу загорится зеленый индикатор «Подключено».</w:t>
       </w:r>
     </w:p>
     <w:p>
       <w:pPr/>
       <w:r>
-        <w:rPr>
-          <w:b/>
-        </w:rPr>
-        <w:t xml:space="preserve">•  Оптимизация запуска бэкенда: </w:t>
-      </w:r>
-      <w:r>
-        <w:t>Скрипты запуска автоматически переключаются с команды py -3 на python при отсутствии лаунчера. Внедрена система ожидания (до 30 попыток / 60 секунд) загрузки ML-модели в видеопамять RTX 3090, выводящая текущий прогресс в консоль.</w:t>
+        <w:t>•  Оптимизация запуска бэкенда: Скрипты автоматически применяют флаги --protocol http2 для обхода блокировок и ждут загрузки ML-модели в видеопамять RTX 3090.</w:t>
       </w:r>
     </w:p>
     <w:p>
@@ -893,7 +884,7 @@
           </w:tcPr>
           <w:p>
             <w:r>
-              <w:t>Проверьте, запущена ли консоль start_localtunnel.bat. Если она запущена, убедитесь, что вы перешли по ссылке https://hfr-alex-font.loca.lt напрямую в новой вкладке и ввели свой IP-адрес для прохождения проверки от ботов.</w:t>
+              <w:t>Проверьте, запущена ли консоль start_stable_tunnel.bat. Убедитесь, что вы скопировали сгенерированную ссылку (https://...trycloudflare.com) из консоли туннеля и вставили её в поле 'URL вашего бэкенда' в левой панели настроек сайта. При каждом новом перезапуске скрипта ссылка меняется!</w:t>
             </w:r>
           </w:p>
         </w:tc>
@@ -905,10 +896,7 @@
           </w:tcPr>
           <w:p>
             <w:r>
-              <w:rPr>
-                <w:b/>
-              </w:rPr>
-              <w:t>Localtunnel долго грузится или не запускается</w:t>
+              <w:t>Туннель Cloudflare не запускается (ошибки DNS/QUIC)</w:t>
             </w:r>
           </w:p>
         </w:tc>
@@ -918,7 +906,7 @@
           </w:tcPr>
           <w:p>
             <w:r>
-              <w:t>Иногда сервера Localtunnel бывают перегружены. Закройте консоль и запустите start_stable_tunnel.bat. Скопируйте созданный URL (вида https://xxxx.trycloudflare.com), откройте на сайте «Настройки API» в боковой панели и вставьте этот адрес туда.</w:t>
+              <w:t>Все скрипты обновлены для обхода блокировок. Если проблема сохраняется, попробуйте запустить start_pinggy.bat и использовать ссылку, которую выдаст SSH-туннель.</w:t>
             </w:r>
           </w:p>
         </w:tc>

</xml_diff>

<commit_message>
feat: visual refinements, localizations, and quick launchers (start_local / start_github)
</commit_message>
<xml_diff>
--- a/Readme.docx
+++ b/Readme.docx
@@ -124,261 +124,100 @@
         <w:spacing w:before="240" w:after="120"/>
       </w:pPr>
       <w:r>
-        <w:rPr>
-          <w:rFonts w:ascii="Segoe UI" w:hAnsi="Segoe UI"/>
-          <w:color w:val="6C63FF"/>
-          <w:sz w:val="36"/>
-        </w:rPr>
-        <w:t>2. Запуск локального сервера и туннеля</w:t>
+        <w:t>2. Быстрый запуск системы (одной кнопкой)</w:t>
       </w:r>
     </w:p>
     <w:p>
-      <w:pPr>
-        <w:spacing w:after="160"/>
-      </w:pPr>
       <w:r>
-        <w:t>Для того чтобы сайт мог связаться с вашей видеокартой, необходимо запустить сервер и туннель. Из-за блокировок протоколов QUIC и сервиса Localtunnel в РФ, рекомендуется использовать стабильный туннель Cloudflare с принудительным обходом через HTTP/2 и IPv4.</w:t>
-      </w:r>
-    </w:p>
-    <w:tbl>
-      <w:tblPr>
-        <w:tblStyle w:val="LightShading-Accent1"/>
-        <w:tblW w:type="auto" w:w="0"/>
-        <w:tblLook w:firstColumn="1" w:firstRow="1" w:lastColumn="0" w:lastRow="0" w:noHBand="0" w:noVBand="1" w:val="04A0"/>
-      </w:tblPr>
-      <w:tblGrid>
-        <w:gridCol w:w="3120"/>
-        <w:gridCol w:w="3120"/>
-        <w:gridCol w:w="3120"/>
-      </w:tblGrid>
-      <w:tr>
-        <w:tc>
-          <w:tcPr>
-            <w:tcW w:type="dxa" w:w="3120"/>
-            <w:shd w:fill="6C63FF"/>
-          </w:tcPr>
-          <w:p>
-            <w:r>
-              <w:rPr>
-                <w:b/>
-                <w:color w:val="FFFFFF"/>
-              </w:rPr>
-              <w:t>Файл запуска</w:t>
-            </w:r>
-          </w:p>
-        </w:tc>
-        <w:tc>
-          <w:tcPr>
-            <w:tcW w:type="dxa" w:w="3120"/>
-            <w:shd w:fill="6C63FF"/>
-          </w:tcPr>
-          <w:p>
-            <w:r>
-              <w:rPr>
-                <w:b/>
-                <w:color w:val="FFFFFF"/>
-              </w:rPr>
-              <w:t>Используемый мост</w:t>
-            </w:r>
-          </w:p>
-        </w:tc>
-        <w:tc>
-          <w:tcPr>
-            <w:tcW w:type="dxa" w:w="3120"/>
-            <w:shd w:fill="6C63FF"/>
-          </w:tcPr>
-          <w:p>
-            <w:r>
-              <w:rPr>
-                <w:b/>
-                <w:color w:val="FFFFFF"/>
-              </w:rPr>
-              <w:t>Особенности / Стабильность</w:t>
-            </w:r>
-          </w:p>
-        </w:tc>
-      </w:tr>
-      <w:tr>
-        <w:tc>
-          <w:tcPr>
-            <w:tcW w:type="dxa" w:w="3120"/>
-          </w:tcPr>
-          <w:p>
-            <w:r>
-              <w:t>start_stable_tunnel.bat (РЕКОМЕНДУЕТСЯ)</w:t>
-            </w:r>
-          </w:p>
-        </w:tc>
-        <w:tc>
-          <w:tcPr>
-            <w:tcW w:type="dxa" w:w="3120"/>
-          </w:tcPr>
-          <w:p>
-            <w:r>
-              <w:t>Cloudflare Tunnel (HTTP/2)</w:t>
-            </w:r>
-          </w:p>
-        </w:tc>
-        <w:tc>
-          <w:tcPr>
-            <w:tcW w:type="dxa" w:w="3120"/>
-          </w:tcPr>
-          <w:p>
-            <w:r>
-              <w:t>Максимально стабилен, обходит блокировки QUIC. Генерирует новый случайный URL (.trycloudflare.com) при каждом запуске.</w:t>
-            </w:r>
-          </w:p>
-        </w:tc>
-      </w:tr>
-      <w:tr>
-        <w:tc>
-          <w:tcPr>
-            <w:tcW w:type="dxa" w:w="3120"/>
-          </w:tcPr>
-          <w:p>
-            <w:r>
-              <w:t>start_server.bat</w:t>
-            </w:r>
-          </w:p>
-        </w:tc>
-        <w:tc>
-          <w:tcPr>
-            <w:tcW w:type="dxa" w:w="3120"/>
-          </w:tcPr>
-          <w:p>
-            <w:r>
-              <w:t>Cloudflare Tunnel (HTTP/2)</w:t>
-            </w:r>
-          </w:p>
-        </w:tc>
-        <w:tc>
-          <w:tcPr>
-            <w:tcW w:type="dxa" w:w="3120"/>
-          </w:tcPr>
-          <w:p>
-            <w:r>
-              <w:t>То же самое, что и stable_tunnel, запускает бэкенд и туннель.</w:t>
-            </w:r>
-          </w:p>
-        </w:tc>
-      </w:tr>
-      <w:tr>
-        <w:tc>
-          <w:tcPr>
-            <w:tcW w:type="dxa" w:w="3120"/>
-          </w:tcPr>
-          <w:p>
-            <w:r>
-              <w:t>start_pinggy.bat</w:t>
-            </w:r>
-          </w:p>
-        </w:tc>
-        <w:tc>
-          <w:tcPr>
-            <w:tcW w:type="dxa" w:w="3120"/>
-          </w:tcPr>
-          <w:p>
-            <w:r>
-              <w:t>Pinggy SSH Tunnel (.pinggy.link)</w:t>
-            </w:r>
-          </w:p>
-        </w:tc>
-        <w:tc>
-          <w:tcPr>
-            <w:tcW w:type="dxa" w:w="3120"/>
-          </w:tcPr>
-          <w:p>
-            <w:r>
-              <w:t>Резервный канал связи через SSH-туннелирование на порт 443.</w:t>
-            </w:r>
-          </w:p>
-        </w:tc>
-      </w:tr>
-      <w:tr>
-        <w:tc>
-          <w:tcPr>
-            <w:tcW w:type="dxa" w:w="3120"/>
-          </w:tcPr>
-          <w:p>
-            <w:r>
-              <w:t>start_localtunnel.bat (НЕ РАБОТАЕТ)</w:t>
-            </w:r>
-          </w:p>
-        </w:tc>
-        <w:tc>
-          <w:tcPr>
-            <w:tcW w:type="dxa" w:w="3120"/>
-          </w:tcPr>
-          <w:p>
-            <w:r>
-              <w:t>Localtunnel (hfr-alex-font-v2.loca.lt)</w:t>
-            </w:r>
-          </w:p>
-        </w:tc>
-        <w:tc>
-          <w:tcPr>
-            <w:tcW w:type="dxa" w:w="3120"/>
-          </w:tcPr>
-          <w:p>
-            <w:r>
-              <w:t>Временно не рекомендуется из-за глубоких блокировок домена loca.lt провайдерами.</w:t>
-            </w:r>
-          </w:p>
-        </w:tc>
-      </w:tr>
-    </w:tbl>
-    <w:p>
-      <w:pPr>
-        <w:spacing w:after="240"/>
-      </w:pPr>
-    </w:p>
-    <w:p>
-      <w:pPr>
-        <w:pStyle w:val="Heading2"/>
-        <w:keepNext/>
-        <w:spacing w:before="240" w:after="120"/>
-      </w:pPr>
-      <w:r>
-        <w:t>Пошаговый процесс запуска (через Cloudflare Tunnel):</w:t>
+        <w:t>В корневой папке проекта подготовлены автоматические скрипты для запуска всей системы в один клик:</w:t>
       </w:r>
     </w:p>
     <w:p>
-      <w:pPr>
-        <w:spacing w:after="120"/>
-        <w:ind w:left="360"/>
-      </w:pPr>
+      <w:r/>
+    </w:p>
+    <w:p>
       <w:r>
-        <w:t>•  Шаг 1. Запуск скрипта: Дважды кликните по файлу start_stable_tunnel.bat (или start_server.bat). Откроется консоль. Скрипт запустит FastAPI-сервер на видеокарте и поднимет туннель Cloudflare.</w:t>
+        <w:t>А. Запуск локальной версии:</w:t>
       </w:r>
     </w:p>
     <w:p>
-      <w:pPr>
-        <w:spacing w:after="120"/>
-        <w:ind w:left="360"/>
-      </w:pPr>
       <w:r>
-        <w:t>•  Шаг 2. Копирование ссылки: Дождитесь появления в консоли строки с вашей уникальной ссылкой вида https://[случайные-слова].trycloudflare.com. Выделите ее и скопируйте.</w:t>
+        <w:t>Запустите файл start_local.bat. Скрипт:</w:t>
       </w:r>
     </w:p>
     <w:p>
-      <w:pPr>
-        <w:spacing w:after="120"/>
-        <w:ind w:left="360"/>
-      </w:pPr>
       <w:r>
-        <w:t>•  Шаг 3. Подключение сайта: Откройте сайт https://alexmurzai.github.io/CyrillicFontTransfer/. Откройте левую панель настроек (иконка ползунков), найдите поле «URL вашего бэкенда», вставьте туда скопированную ссылку и нажмите «Сохранить». В левом нижнем углу загорится зеленый индикатор «Подключено».</w:t>
+        <w:t>1. Проверит порт 8000 и запустит FastAPI бэкенд (ML-движок на видеокарте RTX 3090).</w:t>
       </w:r>
     </w:p>
     <w:p>
-      <w:pPr/>
       <w:r>
-        <w:t>•  Оптимизация запуска бэкенда: Скрипты автоматически применяют флаги --protocol http2 для обхода блокировок и ждут загрузки ML-модели в видеопамять RTX 3090.</w:t>
+        <w:t>2. Проверит порт 5173 и запустит локальный Vite веб-сервер.</w:t>
       </w:r>
     </w:p>
     <w:p>
-      <w:pPr>
-        <w:spacing w:after="240"/>
-      </w:pPr>
+      <w:r>
+        <w:t>3. Автоматически откроет в вашем браузере сайт: http://localhost:5173/</w:t>
+      </w:r>
+    </w:p>
+    <w:p>
+      <w:r>
+        <w:t>Все запросы будут идти локально и максимально быстро. В сайдбаре будет доступна кнопка «Настройки API».</w:t>
+      </w:r>
+    </w:p>
+    <w:p>
+      <w:r/>
+    </w:p>
+    <w:p>
+      <w:r>
+        <w:t>Б. Запуск версии на GitHub Pages (внешний сайт):</w:t>
+      </w:r>
+    </w:p>
+    <w:p>
+      <w:r>
+        <w:t>Запустите файл start_github.bat. Скрипт:</w:t>
+      </w:r>
+    </w:p>
+    <w:p>
+      <w:r>
+        <w:t>1. Запустит FastAPI бэкенд на порту 8000.</w:t>
+      </w:r>
+    </w:p>
+    <w:p>
+      <w:r>
+        <w:t>2. Запустит туннель Cloudflare, подождет генерации публичной ссылки и автоматически скопирует её в буфер обмена Windows (вы увидите сообщение об успешном копировании).</w:t>
+      </w:r>
+    </w:p>
+    <w:p>
+      <w:r>
+        <w:t>3. Автоматически откроет в вашем браузере сайт на GitHub: https://alexmurzai.github.io/CyrillicFontTransfer/</w:t>
+      </w:r>
+    </w:p>
+    <w:p>
+      <w:r>
+        <w:t>Вам останется лишь:</w:t>
+      </w:r>
+    </w:p>
+    <w:p>
+      <w:r>
+        <w:t>• Нажать «Настройки API» (иконка шестеренки слева внизу на сайте).</w:t>
+      </w:r>
+    </w:p>
+    <w:p>
+      <w:r>
+        <w:t>• Вставить скопированный URL (нажав Ctrl+V) и начать работу.</w:t>
+      </w:r>
+    </w:p>
+    <w:p>
+      <w:r/>
+    </w:p>
+    <w:p>
+      <w:r>
+        <w:t>Для остановки туннелей и серверов просто закройте открывшиеся окна консоли.</w:t>
+      </w:r>
+    </w:p>
+    <w:p>
+      <w:r/>
     </w:p>
     <w:p>
       <w:pPr>

</xml_diff>

<commit_message>
Update Readme.txt and Readme.docx with Section 5 describing the Font Collection Manager
</commit_message>
<xml_diff>
--- a/Readme.docx
+++ b/Readme.docx
@@ -647,18 +647,83 @@
       </w:pPr>
     </w:p>
     <w:p>
+      <w:r>
+        <w:t>5. Управление коллекцией шрифтов (Добавление и очистка)</w:t>
+      </w:r>
+    </w:p>
+    <w:p>
+      <w:r>
+        <w:t>В проект встроен интерактивный менеджер для работы с коллекцией шрифтов. Он позволяет легко очищать базу от демонстрационных/триальных версий, импортировать новые шрифты с ПК без дубликатов и автоматически пересобирать векторный FAISS-индекс.</w:t>
+      </w:r>
+    </w:p>
+    <w:p>
+      <w:r/>
+    </w:p>
+    <w:p>
+      <w:r>
+        <w:t>Как запустить менеджер:</w:t>
+      </w:r>
+    </w:p>
+    <w:p>
+      <w:r>
+        <w:t>Запустите файл manage_collection.bat в корневой папке проекта. Откроется текстовое меню со следующими возможностями:</w:t>
+      </w:r>
+    </w:p>
+    <w:p>
+      <w:r/>
+    </w:p>
+    <w:p>
+      <w:r>
+        <w:t>1. Найти и удалить демо/триал шрифты (Очистка):</w:t>
+      </w:r>
+    </w:p>
+    <w:p>
+      <w:r>
+        <w:t>Скрипт автоматически сканирует все папки со шрифтами (All fonts..., Fonts CYR, fonts_db) на наличие в названии файлов ключевых слов (trial, demo, free-version, watermark, sample и др.). Вы сможете удалить все найденные триальные файлы разом или выбрать конкретные номера для удаления.</w:t>
+      </w:r>
+    </w:p>
+    <w:p>
+      <w:r/>
+    </w:p>
+    <w:p>
+      <w:r>
+        <w:t>2. Импортировать новые шрифты из внешней папки:</w:t>
+      </w:r>
+    </w:p>
+    <w:p>
+      <w:r>
+        <w:t>Введите путь к папке с новыми шрифтами на вашем ПК. Скрипт рекурсивно найдет все файлы .ttf / .otf, проверит их MD5-хэши во избежание дубликатов и скопирует только уникальные файлы в папку проекта: fonts_db/imported_fonts.</w:t>
+      </w:r>
+    </w:p>
+    <w:p>
+      <w:r/>
+    </w:p>
+    <w:p>
+      <w:r>
+        <w:t>3. Пересобрать векторную базу данных (FAISS):</w:t>
+      </w:r>
+    </w:p>
+    <w:p>
+      <w:r>
+        <w:t>После добавления или удаления файлов запустите этот пункт. Скрипт автоматически обновит data/fonts_index.json, прогонит новые шрифты через нейросеть HFRNet (используя CUDA на вашей RTX 3090) и перезапишет индекс data/font_signatures.faiss.</w:t>
+      </w:r>
+    </w:p>
+    <w:p>
+      <w:r>
+        <w:t>Для применения изменений на сайте перезапустите бэкенд (start_github.bat / start_local.bat).</w:t>
+      </w:r>
+    </w:p>
+    <w:p>
+      <w:r/>
+    </w:p>
+    <w:p>
       <w:pPr>
         <w:pStyle w:val="Heading1"/>
         <w:keepNext/>
         <w:spacing w:before="240" w:after="120"/>
       </w:pPr>
       <w:r>
-        <w:rPr>
-          <w:rFonts w:ascii="Segoe UI" w:hAnsi="Segoe UI"/>
-          <w:color w:val="6C63FF"/>
-          <w:sz w:val="36"/>
-        </w:rPr>
-        <w:t>5. Возможные проблемы и решения</w:t>
+        <w:t>6. Возможные проблемы и решения</w:t>
       </w:r>
     </w:p>
     <w:tbl>
@@ -723,7 +788,7 @@
           </w:tcPr>
           <w:p>
             <w:r>
-              <w:t>Проверьте, запущена ли консоль start_stable_tunnel.bat. Убедитесь, что вы скопировали сгенерированную ссылку (https://...trycloudflare.com) из консоли туннеля и вставили её в поле 'URL вашего бэкенда' в левой панели настроек сайта. При каждом новом перезапуске скрипта ссылка меняется!</w:t>
+              <w:t>Проверить, запущена ли консоль start_github.bat (или start_local.bat). Убедитесь, что бэкенд и туннель запущены успешно. В случае работы с GitHub Pages, если автонастройка не сработала, скопируйте ссылку туннеля из буфера обмена, откройте «Настройки API» в боковой панели сайта (доступны при логине под admin-email) и вставьте её туда вручную.</w:t>
             </w:r>
           </w:p>
         </w:tc>
@@ -745,7 +810,7 @@
           </w:tcPr>
           <w:p>
             <w:r>
-              <w:t>Все скрипты обновлены для обхода блокировок. Если проблема сохраняется, попробуйте запустить start_pinggy.bat и использовать ссылку, которую выдаст SSH-туннель.</w:t>
+              <w:t>Для стабильного соединения используйте туннель Cloudflare через start_github.bat, он работает быстрее и надежнее других способов.</w:t>
             </w:r>
           </w:p>
         </w:tc>

</xml_diff>

<commit_message>
Update font counters dynamically on DB rebuild & terminate active port 8000 processes on server launch
</commit_message>
<xml_diff>
--- a/Readme.docx
+++ b/Readme.docx
@@ -69,13 +69,7 @@
         <w:spacing w:after="80"/>
       </w:pPr>
       <w:r>
-        <w:rPr>
-          <w:b/>
-        </w:rPr>
-        <w:t xml:space="preserve">Локальный бэкенд (на вашем ПК): </w:t>
-      </w:r>
-      <w:r>
-        <w:t>FastAPI-сервер, который загружает веса нейросети MOCTNet v2.1 (на базе HFRNet v2.1) на базе EfficientNet-B0 в видеопамять видеокарты NVIDIA RTX 3090 (24 GB VRAM) и производит мгновенный векторный поиск по FAISS-индексу (6231 кириллический шрифт).</w:t>
+        <w:t>Локальный бэкенд (на вашем ПК): FastAPI-сервер, который загружает веса нейросети MOCTNet v2.1 (на базе HFRNet v2.1) на базе EfficientNet-B0 в видеопамять видеокарты NVIDIA RTX 3090 (24 GB VRAM) и производит мгновенный векторный поиск по FAISS-индексу (6231 кириллический шрифт).</w:t>
       </w:r>
     </w:p>
     <w:p>

</xml_diff>

<commit_message>
feat: improve QR code rendering and add alternative mobile startup scripts
</commit_message>
<xml_diff>
--- a/Readme.docx
+++ b/Readme.docx
@@ -4,37 +4,28 @@
   <w:body>
     <w:p>
       <w:pPr>
-        <w:spacing w:after="360"/>
-        <w:jc w:val="center"/>
+        <w:spacing w:after="80" w:line="276" w:lineRule="auto"/>
       </w:pPr>
       <w:r>
-        <w:rPr>
-          <w:rFonts w:ascii="Segoe UI" w:hAnsi="Segoe UI"/>
-          <w:b/>
-          <w:color w:val="6C63FF"/>
-          <w:sz w:val="48"/>
-        </w:rPr>
         <w:t>🖋️ МОСТ — Cyrillic Font Matcher (Интеллектуальный подбор кириллических аналогов)</w:t>
       </w:r>
     </w:p>
     <w:p>
       <w:pPr>
-        <w:spacing w:after="480"/>
-        <w:jc w:val="center"/>
+        <w:spacing w:before="120" w:after="240"/>
       </w:pPr>
       <w:r>
         <w:rPr>
-          <w:rFonts w:ascii="Segoe UI" w:hAnsi="Segoe UI"/>
-          <w:i/>
-          <w:color w:val="6C7086"/>
-          <w:sz w:val="26"/>
+          <w:b/>
+          <w:color w:val="003366"/>
+          <w:sz w:val="32"/>
         </w:rPr>
         <w:t>Инструкция по запуску локального бэкенда, использованию веб-интерфейса и аналитике</w:t>
       </w:r>
     </w:p>
     <w:p>
       <w:pPr>
-        <w:spacing w:after="240" w:line="276" w:lineRule="auto"/>
+        <w:spacing w:after="80" w:line="276" w:lineRule="auto"/>
       </w:pPr>
       <w:r>
         <w:t>Этот документ содержит подробную пошаговую инструкцию по запуску локальной нейросетевой части системы подбора шрифтов (МОСТ) на вашем компьютере, подключению к ней веб-интерфейса и работе с локальной системой сбора статистики (аналитики).</w:t>
@@ -42,22 +33,20 @@
     </w:p>
     <w:p>
       <w:pPr>
-        <w:pStyle w:val="Heading1"/>
-        <w:keepNext/>
-        <w:spacing w:before="240" w:after="120"/>
+        <w:spacing w:before="120" w:after="240"/>
       </w:pPr>
       <w:r>
         <w:rPr>
-          <w:rFonts w:ascii="Segoe UI" w:hAnsi="Segoe UI"/>
-          <w:color w:val="6C63FF"/>
-          <w:sz w:val="36"/>
+          <w:b/>
+          <w:color w:val="003366"/>
+          <w:sz w:val="32"/>
         </w:rPr>
         <w:t>1. Архитектурная схема системы</w:t>
       </w:r>
     </w:p>
     <w:p>
       <w:pPr>
-        <w:spacing w:after="240"/>
+        <w:spacing w:after="80" w:line="276" w:lineRule="auto"/>
       </w:pPr>
       <w:r>
         <w:t>Система состоит из трех ключевых компонентов:</w:t>
@@ -65,172 +54,384 @@
     </w:p>
     <w:p>
       <w:pPr>
-        <w:pStyle w:val="ListBullet"/>
-        <w:spacing w:after="80"/>
+        <w:spacing w:after="80" w:line="276" w:lineRule="auto"/>
+        <w:ind w:left="360"/>
       </w:pPr>
       <w:r>
-        <w:t>Локальный бэкенд (на вашем ПК): FastAPI-сервер, который загружает веса нейросети MOCTNet v2.1 (на базе HFRNet v2.1) на базе EfficientNet-B0 в видеопамять видеокарты NVIDIA RTX 3090 (24 GB VRAM) и производит мгновенный векторный поиск по FAISS-индексу (6231 кириллический шрифт).</w:t>
+        <w:t>• Локальный бэкенд (на вашем ПК): FastAPI-сервер, который загружает веса нейросети MOCTNet v2.1 (на базе HFRNet v2.1) на базе EfficientNet-B0 в видеопамять видеокарты NVIDIA RTX 3090 (24 GB VRAM) и производит мгновенный векторный поиск по FAISS-индексу (6231 кириллический шрифт).</w:t>
       </w:r>
     </w:p>
     <w:p>
       <w:pPr>
-        <w:pStyle w:val="ListBullet"/>
-        <w:spacing w:after="80"/>
+        <w:spacing w:after="80" w:line="276" w:lineRule="auto"/>
+        <w:ind w:left="360"/>
+      </w:pPr>
+      <w:r>
+        <w:t>• Внешний веб-интерфейс (фронтенд): Развернут на GitHub Pages по адресу https://alexmurzai.github.io/CyrillicFontTransfer/. Работает в браузере и отправляет запросы на ваш компьютер через защищенный туннель.</w:t>
+      </w:r>
+    </w:p>
+    <w:p>
+      <w:pPr>
+        <w:spacing w:after="80" w:line="276" w:lineRule="auto"/>
+        <w:ind w:left="360"/>
+      </w:pPr>
+      <w:r>
+        <w:t>• Локальная база аналитики: База данных SQLite (data/hfr_stats.db), которая автоматически логирует визиты пользователей, поисковые запросы и скачивания файлов шрифтов.</w:t>
+      </w:r>
+    </w:p>
+    <w:p>
+      <w:pPr>
+        <w:spacing w:before="120" w:after="240"/>
       </w:pPr>
       <w:r>
         <w:rPr>
           <w:b/>
+          <w:color w:val="003366"/>
+          <w:sz w:val="32"/>
         </w:rPr>
-        <w:t xml:space="preserve">Внешний веб-интерфейс (фронтенд): </w:t>
-      </w:r>
-      <w:r>
-        <w:t xml:space="preserve">Развернут на GitHub Pages по адресу </w:t>
-      </w:r>
-      <w:r>
-        <w:rPr>
-          <w:color w:val="6C63FF"/>
-        </w:rPr>
-        <w:t>https://alexmurzai.github.io/CyrillicFontTransfer/</w:t>
-      </w:r>
-      <w:r>
-        <w:t>. Работает в браузере и отправляет запросы на ваш компьютер через защищенный HTTPS-туннель.</w:t>
+        <w:t>2. Быстрый запуск системы (одной кнопкой)</w:t>
       </w:r>
     </w:p>
     <w:p>
       <w:pPr>
-        <w:pStyle w:val="ListBullet"/>
-        <w:spacing w:after="240"/>
+        <w:spacing w:after="80" w:line="276" w:lineRule="auto"/>
       </w:pPr>
-      <w:r>
-        <w:rPr>
-          <w:b/>
-        </w:rPr>
-        <w:t xml:space="preserve">Локальная база аналитики: </w:t>
-      </w:r>
-      <w:r>
-        <w:t>База данных SQLite (data/hfr_stats.db), которая автоматически логирует визиты пользователей, поисковые запросы и скачивания файлов шрифтов.</w:t>
-      </w:r>
-    </w:p>
-    <w:p>
-      <w:pPr>
-        <w:pStyle w:val="Heading1"/>
-        <w:keepNext/>
-        <w:spacing w:before="240" w:after="120"/>
-      </w:pPr>
-      <w:r>
-        <w:t>2. Быстрый запуск системы (одной кнопкой)</w:t>
-      </w:r>
-    </w:p>
-    <w:p>
       <w:r>
         <w:t>В корневой папке проекта подготовлены автоматические скрипты для запуска всей системы в один клик:</w:t>
       </w:r>
     </w:p>
     <w:p>
-      <w:r/>
-    </w:p>
-    <w:p>
+      <w:pPr>
+        <w:keepNext/>
+        <w:spacing w:before="200" w:after="120"/>
+      </w:pPr>
       <w:r>
+        <w:rPr>
+          <w:b/>
+          <w:sz w:val="22"/>
+        </w:rPr>
         <w:t>А. Запуск локальной версии:</w:t>
       </w:r>
     </w:p>
     <w:p>
+      <w:pPr>
+        <w:spacing w:after="80" w:line="276" w:lineRule="auto"/>
+      </w:pPr>
       <w:r>
         <w:t>Запустите файл start_local.bat. Скрипт:</w:t>
       </w:r>
     </w:p>
     <w:p>
+      <w:pPr>
+        <w:keepNext/>
+        <w:spacing w:before="320" w:after="160"/>
+      </w:pPr>
       <w:r>
+        <w:rPr>
+          <w:b/>
+          <w:color w:val="0066CC"/>
+          <w:sz w:val="26"/>
+        </w:rPr>
         <w:t>1. Проверит порт 8000 и запустит FastAPI бэкенд (ML-движок на видеокарте RTX 3090).</w:t>
       </w:r>
     </w:p>
     <w:p>
+      <w:pPr>
+        <w:keepNext/>
+        <w:spacing w:before="320" w:after="160"/>
+      </w:pPr>
       <w:r>
+        <w:rPr>
+          <w:b/>
+          <w:color w:val="0066CC"/>
+          <w:sz w:val="26"/>
+        </w:rPr>
         <w:t>2. Проверит порт 5173 и запустит локальный Vite веб-сервер.</w:t>
       </w:r>
     </w:p>
     <w:p>
+      <w:pPr>
+        <w:keepNext/>
+        <w:spacing w:before="320" w:after="160"/>
+      </w:pPr>
       <w:r>
+        <w:rPr>
+          <w:b/>
+          <w:color w:val="0066CC"/>
+          <w:sz w:val="26"/>
+        </w:rPr>
         <w:t>3. Автоматически откроет в вашем браузере сайт: http://localhost:5173/</w:t>
       </w:r>
     </w:p>
     <w:p>
+      <w:pPr>
+        <w:spacing w:after="80" w:line="276" w:lineRule="auto"/>
+      </w:pPr>
       <w:r>
         <w:t>Все запросы будут идти локально и максимально быстро. В сайдбаре будет доступна кнопка «Настройки API».</w:t>
       </w:r>
     </w:p>
     <w:p>
-      <w:r/>
-    </w:p>
-    <w:p>
+      <w:pPr>
+        <w:keepNext/>
+        <w:spacing w:before="200" w:after="120"/>
+      </w:pPr>
       <w:r>
+        <w:rPr>
+          <w:b/>
+          <w:sz w:val="22"/>
+        </w:rPr>
         <w:t>Б. Запуск версии на GitHub Pages (внешний сайт):</w:t>
       </w:r>
     </w:p>
     <w:p>
+      <w:pPr>
+        <w:spacing w:after="80" w:line="276" w:lineRule="auto"/>
+      </w:pPr>
       <w:r>
         <w:t>Запустите файл start_github.bat. Скрипт:</w:t>
       </w:r>
     </w:p>
     <w:p>
+      <w:pPr>
+        <w:keepNext/>
+        <w:spacing w:before="320" w:after="160"/>
+      </w:pPr>
       <w:r>
+        <w:rPr>
+          <w:b/>
+          <w:color w:val="0066CC"/>
+          <w:sz w:val="26"/>
+        </w:rPr>
         <w:t>1. Запустит FastAPI бэкенд на порту 8000.</w:t>
       </w:r>
     </w:p>
     <w:p>
+      <w:pPr>
+        <w:keepNext/>
+        <w:spacing w:before="320" w:after="160"/>
+      </w:pPr>
       <w:r>
-        <w:t>2. Запустит туннель Cloudflare, подождет генерации публичной ссылки и автоматически скопирует её в буфер обмена Windows (вы увидите сообщение об успешном копировании).</w:t>
+        <w:rPr>
+          <w:b/>
+          <w:color w:val="0066CC"/>
+          <w:sz w:val="26"/>
+        </w:rPr>
+        <w:t>2. Запустит туннель Cloudflare, подождет генерации публичной ссылки и автоматически скопирует её в буфер обмена Windows.</w:t>
       </w:r>
     </w:p>
     <w:p>
+      <w:pPr>
+        <w:keepNext/>
+        <w:spacing w:before="320" w:after="160"/>
+      </w:pPr>
       <w:r>
+        <w:rPr>
+          <w:b/>
+          <w:color w:val="0066CC"/>
+          <w:sz w:val="26"/>
+        </w:rPr>
         <w:t>3. Автоматически откроет в вашем браузере сайт на GitHub: https://alexmurzai.github.io/CyrillicFontTransfer/</w:t>
       </w:r>
     </w:p>
     <w:p>
+      <w:pPr>
+        <w:keepNext/>
+        <w:spacing w:before="320" w:after="160"/>
+      </w:pPr>
       <w:r>
-        <w:t>Вам останется лишь:</w:t>
+        <w:rPr>
+          <w:b/>
+          <w:color w:val="0066CC"/>
+          <w:sz w:val="26"/>
+        </w:rPr>
+        <w:t>4. Сгенерирует QR-код для мобильного доступа и откроет его в окне просмотра изображений на ПК.</w:t>
       </w:r>
     </w:p>
     <w:p>
+      <w:pPr>
+        <w:keepNext/>
+        <w:spacing w:before="200" w:after="120"/>
+      </w:pPr>
       <w:r>
-        <w:t>• Нажать «Настройки API» (иконка шестеренки слева внизу на сайте).</w:t>
+        <w:rPr>
+          <w:b/>
+          <w:sz w:val="22"/>
+        </w:rPr>
+        <w:t>В. Локальный мобильный запуск (LAN Wi-Fi) — [РЕКОМЕНДУЕТСЯ для телефона]:</w:t>
       </w:r>
     </w:p>
     <w:p>
+      <w:pPr>
+        <w:spacing w:after="80" w:line="276" w:lineRule="auto"/>
+      </w:pPr>
       <w:r>
-        <w:t>• Вставить скопированный URL (нажав Ctrl+V) и начать работу.</w:t>
+        <w:t>Запустите файл start_mobile_local.bat. Скрипт:</w:t>
       </w:r>
     </w:p>
     <w:p>
-      <w:r/>
+      <w:pPr>
+        <w:keepNext/>
+        <w:spacing w:before="320" w:after="160"/>
+      </w:pPr>
+      <w:r>
+        <w:rPr>
+          <w:b/>
+          <w:color w:val="0066CC"/>
+          <w:sz w:val="26"/>
+        </w:rPr>
+        <w:t>1. Определит локальный сетевой IP-адрес вашего ПК (например, 10.0.0.1 или 192.168.0.111).</w:t>
+      </w:r>
     </w:p>
     <w:p>
+      <w:pPr>
+        <w:keepNext/>
+        <w:spacing w:before="320" w:after="160"/>
+      </w:pPr>
+      <w:r>
+        <w:rPr>
+          <w:b/>
+          <w:color w:val="0066CC"/>
+          <w:sz w:val="26"/>
+        </w:rPr>
+        <w:t>2. Запустит бэкенд на порту 8000 и Vite-сервер на порту 5173 с привязкой к вашей локальной сети.</w:t>
+      </w:r>
+    </w:p>
+    <w:p>
+      <w:pPr>
+        <w:keepNext/>
+        <w:spacing w:before="320" w:after="160"/>
+      </w:pPr>
+      <w:r>
+        <w:rPr>
+          <w:b/>
+          <w:color w:val="0066CC"/>
+          <w:sz w:val="26"/>
+        </w:rPr>
+        <w:t>3. Сгенерирует QR-код с настроенным адресом API (http://&lt;IP&gt;:5173/?api_url=http://&lt;IP&gt;:8000) и откроет его на вашем экране.</w:t>
+      </w:r>
+    </w:p>
+    <w:p>
+      <w:pPr>
+        <w:spacing w:after="80" w:line="276" w:lineRule="auto"/>
+      </w:pPr>
+      <w:r>
+        <w:t>Вам нужно лишь:</w:t>
+      </w:r>
+    </w:p>
+    <w:p>
+      <w:pPr>
+        <w:spacing w:after="80" w:line="276" w:lineRule="auto"/>
+        <w:ind w:left="360"/>
+      </w:pPr>
+      <w:r>
+        <w:t>• Подключить телефон к той же Wi-Fi сети, что и компьютер.</w:t>
+      </w:r>
+    </w:p>
+    <w:p>
+      <w:pPr>
+        <w:spacing w:after="80" w:line="276" w:lineRule="auto"/>
+        <w:ind w:left="360"/>
+      </w:pPr>
+      <w:r>
+        <w:t>• Отсканировать открывшийся QR-код камерой телефона. Это самый быстрый и надежный способ работы на мобильном телефоне, не зависящий от провайдеров!</w:t>
+      </w:r>
+    </w:p>
+    <w:p>
+      <w:pPr>
+        <w:keepNext/>
+        <w:spacing w:before="200" w:after="120"/>
+      </w:pPr>
+      <w:r>
+        <w:rPr>
+          <w:b/>
+          <w:sz w:val="22"/>
+        </w:rPr>
+        <w:t>Г. Мобильный запуск через альтернативный SSH-туннель (Pinggy):</w:t>
+      </w:r>
+    </w:p>
+    <w:p>
+      <w:pPr>
+        <w:spacing w:after="80" w:line="276" w:lineRule="auto"/>
+      </w:pPr>
+      <w:r>
+        <w:t>Если вам нужно запустить систему на телефоне через мобильный интернет (вне Wi-Fi сети ПК), запустите start_pinggy.bat. Скрипт:</w:t>
+      </w:r>
+    </w:p>
+    <w:p>
+      <w:pPr>
+        <w:keepNext/>
+        <w:spacing w:before="320" w:after="160"/>
+      </w:pPr>
+      <w:r>
+        <w:rPr>
+          <w:b/>
+          <w:color w:val="0066CC"/>
+          <w:sz w:val="26"/>
+        </w:rPr>
+        <w:t>1. Запустит FastAPI бэкенд на порту 8000.</w:t>
+      </w:r>
+    </w:p>
+    <w:p>
+      <w:pPr>
+        <w:keepNext/>
+        <w:spacing w:before="320" w:after="160"/>
+      </w:pPr>
+      <w:r>
+        <w:rPr>
+          <w:b/>
+          <w:color w:val="0066CC"/>
+          <w:sz w:val="26"/>
+        </w:rPr>
+        <w:t>2. Запустит SSH-туннель через Pinggy, автоматически получит публичную ссылку (*.pinggy-free.link) и скопирует её в буфер обмена.</w:t>
+      </w:r>
+    </w:p>
+    <w:p>
+      <w:pPr>
+        <w:keepNext/>
+        <w:spacing w:before="320" w:after="160"/>
+      </w:pPr>
+      <w:r>
+        <w:rPr>
+          <w:b/>
+          <w:color w:val="0066CC"/>
+          <w:sz w:val="26"/>
+        </w:rPr>
+        <w:t>3. Откроет сайт в браузере и выведет на экран QR-код с настроенным API туннеля.</w:t>
+      </w:r>
+    </w:p>
+    <w:p>
+      <w:pPr>
+        <w:spacing w:after="80" w:line="276" w:lineRule="auto"/>
+      </w:pPr>
+      <w:r>
+        <w:t>Этот туннель работает по стандартному SSH на порту 443 и не блокируется провайдерами в РФ.</w:t>
+      </w:r>
+    </w:p>
+    <w:p>
+      <w:pPr>
+        <w:spacing w:after="80" w:line="276" w:lineRule="auto"/>
+      </w:pPr>
       <w:r>
         <w:t>Для остановки туннелей и серверов просто закройте открывшиеся окна консоли.</w:t>
       </w:r>
     </w:p>
     <w:p>
-      <w:r/>
-    </w:p>
-    <w:p>
       <w:pPr>
-        <w:pStyle w:val="Heading1"/>
-        <w:keepNext/>
-        <w:spacing w:before="240" w:after="120"/>
+        <w:spacing w:before="120" w:after="240"/>
       </w:pPr>
       <w:r>
         <w:rPr>
-          <w:rFonts w:ascii="Segoe UI" w:hAnsi="Segoe UI"/>
-          <w:color w:val="6C63FF"/>
-          <w:sz w:val="36"/>
+          <w:b/>
+          <w:color w:val="003366"/>
+          <w:sz w:val="32"/>
         </w:rPr>
         <w:t>3. Инструкция по работе с интерфейсом подбора</w:t>
       </w:r>
     </w:p>
     <w:p>
       <w:pPr>
-        <w:spacing w:after="160"/>
+        <w:spacing w:after="80" w:line="276" w:lineRule="auto"/>
       </w:pPr>
       <w:r>
         <w:t>Интерфейс веб-приложения разделен на две логические зоны:</w:t>
@@ -238,509 +439,374 @@
     </w:p>
     <w:p>
       <w:pPr>
-        <w:pStyle w:val="ListBullet"/>
-        <w:spacing w:after="80"/>
+        <w:spacing w:after="80" w:line="276" w:lineRule="auto"/>
+        <w:ind w:left="360"/>
       </w:pPr>
       <w:r>
-        <w:rPr>
-          <w:b/>
-        </w:rPr>
-        <w:t xml:space="preserve">Левая панель (Настройки и Ввод) — зафиксирована на экране: </w:t>
-      </w:r>
-      <w:r>
-        <w:t>Здесь находятся зона загрузки изображения, поле ввода текста превью, галерея сегментации и ползунки межсимвольных расстояний.</w:t>
+        <w:t>• Левая панель (Настройки и Ввод) — зафиксирована на экране: Здесь находятся зона загрузки изображения, поле ввода текста превью, галерея сегментации и ползунки межсимвольных расстояний.</w:t>
       </w:r>
     </w:p>
     <w:p>
       <w:pPr>
-        <w:pStyle w:val="ListBullet"/>
-        <w:spacing w:after="240"/>
+        <w:spacing w:after="80" w:line="276" w:lineRule="auto"/>
+        <w:ind w:left="360"/>
       </w:pPr>
       <w:r>
-        <w:rPr>
-          <w:b/>
-        </w:rPr>
-        <w:t xml:space="preserve">Правая панель (Лента результатов) — скроллится независимо: </w:t>
-      </w:r>
-      <w:r>
-        <w:t>Здесь выводятся карточки подобранных кириллических шрифтов с процентом сходства и возможностью скачивания.</w:t>
+        <w:t>• Правая панель (Лента результатов) — скроллится независимо: Здесь выводятся карточки подобранных кириллических шрифтов с процентом сходства и возможностью скачивания.</w:t>
       </w:r>
     </w:p>
     <w:p>
       <w:pPr>
-        <w:pStyle w:val="Heading2"/>
-        <w:keepNext/>
-        <w:spacing w:before="240" w:after="120"/>
+        <w:spacing w:after="80" w:line="276" w:lineRule="auto"/>
       </w:pPr>
       <w:r>
-        <w:rPr>
-          <w:rFonts w:ascii="Segoe UI" w:hAnsi="Segoe UI"/>
-          <w:color w:val="45475A"/>
-          <w:sz w:val="28"/>
-        </w:rPr>
         <w:t>Основные возможности и функции:</w:t>
       </w:r>
     </w:p>
     <w:p>
       <w:pPr>
-        <w:spacing w:after="120"/>
+        <w:spacing w:after="80" w:line="276" w:lineRule="auto"/>
         <w:ind w:left="360"/>
+      </w:pPr>
+      <w:r>
+        <w:t>✔  Загрузка референса: Вы можете загрузить скриншот с латинским шрифтом тремя способами: перетащив файл в зону Drag &amp; Drop, выбрав файл на компьютере, либо сделав снимок с веб-камеры.</w:t>
+      </w:r>
+    </w:p>
+    <w:p>
+      <w:pPr>
+        <w:spacing w:after="80" w:line="276" w:lineRule="auto"/>
+        <w:ind w:left="360"/>
+      </w:pPr>
+      <w:r>
+        <w:t>✔  Автоопределение полярности (Polarity Auto-Detect): Система автоматически определяет яркость фона. Если вы загрузили изображение со светлым текстом на темном фоне, алгоритм автоматически инвертирует его для корректной сегментации букв.</w:t>
+      </w:r>
+    </w:p>
+    <w:p>
+      <w:pPr>
+        <w:spacing w:after="80" w:line="276" w:lineRule="auto"/>
+        <w:ind w:left="360"/>
+      </w:pPr>
+      <w:r>
+        <w:t>✔  Галерея сегментации: После загрузки картинки система выделит отдельные символы с помощью OpenCV (с отступами 30% для сохранения деталей букв) и покажет их в блоке «Сегментация». Это позволяет наглядно убедиться, что нейросеть правильно выделила форму букв.</w:t>
+      </w:r>
+    </w:p>
+    <w:p>
+      <w:pPr>
+        <w:spacing w:after="80" w:line="276" w:lineRule="auto"/>
+        <w:ind w:left="360"/>
+      </w:pPr>
+      <w:r>
+        <w:t>✔  Интерактивное превью: В поле «Текст для демонстрации» вы можете ввести любые русские или латинские слова (например: Привет, мир!). Все карточки результатов мгновенно перерисуют превью этим текстом.</w:t>
+      </w:r>
+    </w:p>
+    <w:p>
+      <w:pPr>
+        <w:spacing w:after="80" w:line="276" w:lineRule="auto"/>
+        <w:ind w:left="360"/>
+      </w:pPr>
+      <w:r>
+        <w:t>✔  Настройка параметров типографики: Используйте ползунки «Межбуквенное расстояние» и «Расстояние между словами» под галереей сегментации. Они позволяют динамически настроить плотность отображения текста для всех шрифтов в ленте результатов.</w:t>
+      </w:r>
+    </w:p>
+    <w:p>
+      <w:pPr>
+        <w:spacing w:after="80" w:line="276" w:lineRule="auto"/>
+        <w:ind w:left="360"/>
+      </w:pPr>
+      <w:r>
+        <w:t>✔  Скачивание шрифтов напрямую: Под каждой карточкой найденного шрифта находится кнопка «Скачать шрифт». Она позволяет в один клик скачать .ttf файл этого шрифта прямо с диска вашего компьютера.</w:t>
+      </w:r>
+    </w:p>
+    <w:p>
+      <w:pPr>
+        <w:spacing w:after="80" w:line="276" w:lineRule="auto"/>
+        <w:ind w:left="360"/>
+      </w:pPr>
+      <w:r>
+        <w:t>✔  Премиальная типографика (стиль Fontfabric): Интерфейс адаптирован под визуальные стандарты Fontfabric с использованием крупных контрастных заголовков и гармоничного темного фона. Интегрированы новые шрифты: Calvino Grande Black (для акцентных заголовков), Stratos Light (для основного UI) и Dotum (для вспомогательного текста), а карточки результатов получили увеличенные превью-блоки (высота до 200px) для наглядности букв.</w:t>
+      </w:r>
+    </w:p>
+    <w:p>
+      <w:pPr>
+        <w:spacing w:after="80" w:line="276" w:lineRule="auto"/>
+        <w:ind w:left="360"/>
+      </w:pPr>
+      <w:r>
+        <w:t>✔  Увеличенный лимит попыток: Количество бесплатных анонимных подборов на одно устройство увеличено с 2 до 5 (отслеживание по цифровому отпечатку браузера).</w:t>
+      </w:r>
+    </w:p>
+    <w:p>
+      <w:pPr>
+        <w:spacing w:after="80" w:line="276" w:lineRule="auto"/>
+        <w:ind w:left="360"/>
+      </w:pPr>
+      <w:r>
+        <w:t>✔  Промо-блок (Discount Banner): В боковую панель встроен стильный блок скидок («ИЮНЬ 50% — Скидка за подписку на 1 год» в виде матовой стеклянной плашки).</w:t>
+      </w:r>
+    </w:p>
+    <w:p>
+      <w:pPr>
+        <w:spacing w:after="80" w:line="276" w:lineRule="auto"/>
+        <w:ind w:left="360"/>
+      </w:pPr>
+      <w:r>
+        <w:t>✔  Бегущая строка (Marquee): Сверху страницы добавлена динамическая бегущая строка с ключевым маркетинговым слоганом: «Сэкономьте 5 часов ручного поиска при адаптации вашего бренда на кириллические рынки. Загрузите латиницу — получите идеальное кириллическое соответствие мгновенно».</w:t>
+      </w:r>
+    </w:p>
+    <w:p>
+      <w:pPr>
+        <w:spacing w:before="120" w:after="240"/>
       </w:pPr>
       <w:r>
         <w:rPr>
           <w:b/>
-        </w:rPr>
-        <w:t xml:space="preserve">✔  Загрузка референса: </w:t>
-      </w:r>
-      <w:r>
-        <w:t>Вы можете загрузить скриншот с латинским шрифтом тремя способами: перетащив файл в зону Drag &amp; Drop, выбрав файл на компьютере, либо сделав снимок с веб-камеры.</w:t>
-      </w:r>
-    </w:p>
-    <w:p>
-      <w:pPr>
-        <w:spacing w:after="120"/>
-        <w:ind w:left="360"/>
-      </w:pPr>
-      <w:r>
-        <w:rPr>
-          <w:b/>
-        </w:rPr>
-        <w:t xml:space="preserve">✔  Автоопределение полярности (Polarity Auto-Detect): </w:t>
-      </w:r>
-      <w:r>
-        <w:t>Система автоматически определяет яркость фона. Если вы загрузили изображение со светлым текстом на темном фоне, алгоритм автоматически инвертирует его для корректной сегментации букв.</w:t>
-      </w:r>
-    </w:p>
-    <w:p>
-      <w:pPr>
-        <w:spacing w:after="120"/>
-        <w:ind w:left="360"/>
-      </w:pPr>
-      <w:r>
-        <w:rPr>
-          <w:b/>
-        </w:rPr>
-        <w:t xml:space="preserve">✔  Галерея сегментации: </w:t>
-      </w:r>
-      <w:r>
-        <w:t>После загрузки картинки система выделит отдельные символы с помощью OpenCV (с отступами 30% для сохранения деталей букв) и покажет их в блоке «Сегментация». Это позволяет наглядно убедиться, что нейросеть правильно выделила форму букв.</w:t>
-      </w:r>
-    </w:p>
-    <w:p>
-      <w:pPr>
-        <w:spacing w:after="120"/>
-        <w:ind w:left="360"/>
-      </w:pPr>
-      <w:r>
-        <w:rPr>
-          <w:b/>
-        </w:rPr>
-        <w:t xml:space="preserve">✔  Интерактивное превью: </w:t>
-      </w:r>
-      <w:r>
-        <w:t>В поле «Текст для демонстрации» вы можете ввести любые русские или латинские слова (например: Привет, мир!). Все карточки результатов мгновенно перерисуют превью этим текстом.</w:t>
-      </w:r>
-    </w:p>
-    <w:p>
-      <w:pPr>
-        <w:spacing w:after="120"/>
-        <w:ind w:left="360"/>
-      </w:pPr>
-      <w:r>
-        <w:rPr>
-          <w:b/>
-        </w:rPr>
-        <w:t xml:space="preserve">✔  Настройка параметров типографики: </w:t>
-      </w:r>
-      <w:r>
-        <w:t>Используйте ползунки «Межбуквенное расстояние» и «Расстояние между словами» под галереей сегментации. Они позволяют динамически настроить плотность отображения текста для всех шрифтов в ленте результатов.</w:t>
-      </w:r>
-    </w:p>
-    <w:p>
-      <w:pPr>
-        <w:spacing w:after="120"/>
-        <w:ind w:left="360"/>
-      </w:pPr>
-      <w:r>
-        <w:rPr>
-          <w:b/>
-        </w:rPr>
-        <w:t xml:space="preserve">✔  Скачивание шрифтов напрямую: </w:t>
-      </w:r>
-      <w:r>
-        <w:t>Под каждой карточкой найденного шрифта находится кнопка «Скачать шрифт». Она позволяет в один клик скачать .ttf файл этого шрифта прямо с диска вашего компьютера.</w:t>
-      </w:r>
-    </w:p>
-    <w:p>
-      <w:pPr/>
-      <w:r>
-        <w:rPr>
-          <w:b/>
-        </w:rPr>
-        <w:t xml:space="preserve">✔  Премиальная типографика (стиль Fontfabric): </w:t>
-      </w:r>
-      <w:r>
-        <w:t>Интерфейс адаптирован под визуальные стандарты Fontfabric с использованием крупных контрастных заголовков и гармоничного темного фона. Интегрированы новые шрифты: Calvino Grande Black (для акцентных заголовков), Stratos Light (для основного UI) и Dotum (для вспомогательного текста), а карточки результатов получили увеличенные превью-блоки (высота до 200px) для наглядности букв.</w:t>
-      </w:r>
-    </w:p>
-    <w:p>
-      <w:pPr/>
-      <w:r>
-        <w:rPr>
-          <w:b/>
-        </w:rPr>
-        <w:t xml:space="preserve">✔  Увеличенный лимит попыток: </w:t>
-      </w:r>
-      <w:r>
-        <w:t>Количество бесплатных анонимных подборов на одно устройство увеличено с 2 до 5 (отслеживание по цифровому отпечатку браузера).</w:t>
-      </w:r>
-    </w:p>
-    <w:p>
-      <w:pPr/>
-      <w:r>
-        <w:rPr>
-          <w:b/>
-        </w:rPr>
-        <w:t xml:space="preserve">✔  Промо-блок (Discount Banner): </w:t>
-      </w:r>
-      <w:r>
-        <w:t>В боковую панель встроен стильный блок скидок («ИЮНЬ 50% — Скидка за подписку на 1 год» в виде матовой стеклянной плашки).</w:t>
-      </w:r>
-    </w:p>
-    <w:p>
-      <w:pPr/>
-      <w:r>
-        <w:rPr>
-          <w:b/>
-        </w:rPr>
-        <w:t xml:space="preserve">✔  Бегущая строка (Marquee): </w:t>
-      </w:r>
-      <w:r>
-        <w:t>Сверху страницы добавлена динамическая бегущая строка с ключевым маркетинговым слоганом: «Сэкономьте 5 часов ручного поиска при адаптации вашего бренда на кириллические рынки. Загрузите латиницу — получите идеальное кириллическое соответствие мгновенно».</w:t>
-      </w:r>
-    </w:p>
-    <w:p>
-      <w:pPr>
-        <w:spacing w:after="240"/>
-      </w:pPr>
-    </w:p>
-    <w:p>
-      <w:pPr>
-        <w:pStyle w:val="Heading1"/>
-        <w:keepNext/>
-        <w:spacing w:before="240" w:after="120"/>
-      </w:pPr>
-      <w:r>
-        <w:rPr>
-          <w:rFonts w:ascii="Segoe UI" w:hAnsi="Segoe UI"/>
-          <w:color w:val="6C63FF"/>
-          <w:sz w:val="36"/>
+          <w:color w:val="003366"/>
+          <w:sz w:val="32"/>
         </w:rPr>
         <w:t>4. Система статистики и аналитики (Дашборд)</w:t>
       </w:r>
     </w:p>
     <w:p>
       <w:pPr>
-        <w:spacing w:after="160"/>
+        <w:spacing w:after="80" w:line="276" w:lineRule="auto"/>
       </w:pPr>
       <w:r>
-        <w:t xml:space="preserve">В проект интегрирована локальная система аналитики. Она полностью автономна и не использует сторонние JS-метрики, что обеспечивает приватность и высокую скорость загрузки. Все данные пишутся в локальную БД SQLite в папке </w:t>
-      </w:r>
-      <w:r>
-        <w:rPr>
-          <w:b/>
-        </w:rPr>
-        <w:t>data/hfr_stats.db</w:t>
-      </w:r>
-      <w:r>
-        <w:t>.</w:t>
+        <w:t>В проект интегрирована локальная система аналитики. Она полностью автономна и не использует сторонние JS-метрики, что обеспечивает приватность и высокую скорость загрузки. Все данные пишутся в локальную БД SQLite в папке data/hfr_stats.db.</w:t>
       </w:r>
     </w:p>
     <w:p>
       <w:pPr>
-        <w:pStyle w:val="Heading2"/>
-        <w:keepNext/>
-        <w:spacing w:before="240" w:after="120"/>
+        <w:spacing w:after="80" w:line="276" w:lineRule="auto"/>
       </w:pPr>
       <w:r>
-        <w:rPr>
-          <w:rFonts w:ascii="Segoe UI" w:hAnsi="Segoe UI"/>
-          <w:color w:val="45475A"/>
-          <w:sz w:val="28"/>
-        </w:rPr>
         <w:t>Как просмотреть статистику:</w:t>
       </w:r>
     </w:p>
     <w:p>
       <w:pPr>
-        <w:spacing w:after="120"/>
-        <w:ind w:left="360"/>
+        <w:spacing w:after="80" w:line="276" w:lineRule="auto"/>
       </w:pPr>
       <w:r>
-        <w:rPr>
-          <w:b/>
-        </w:rPr>
-        <w:t xml:space="preserve">Способ A. Консольная утилита (CLI): </w:t>
-      </w:r>
-      <w:r>
-        <w:t xml:space="preserve">Запустите в консоли команду </w:t>
-      </w:r>
-      <w:r>
-        <w:rPr>
-          <w:b/>
-          <w:color w:val="6C63FF"/>
-        </w:rPr>
-        <w:t>py -3 scripts/show_stats.py</w:t>
-      </w:r>
-      <w:r>
-        <w:t>. Она выведет текстовый дашборд с ASCII-графиками активности и таблицами популярных шрифтов прямо в терминал.</w:t>
+        <w:t>Способ A. Консольная утилита (CLI): Запустите в консоли команду py -3 scripts/show_stats.py. Она выведет текстовый дашборд с ASCII-графиками активности и таблицами популярных шрифтов прямо в терминал.</w:t>
       </w:r>
     </w:p>
     <w:p>
       <w:pPr>
-        <w:spacing w:after="240"/>
-        <w:ind w:left="360"/>
+        <w:spacing w:after="80" w:line="276" w:lineRule="auto"/>
       </w:pPr>
       <w:r>
-        <w:rPr>
-          <w:b/>
-        </w:rPr>
-        <w:t xml:space="preserve">Способ Б. Интерактивный веб-дашборд: </w:t>
-      </w:r>
-      <w:r>
-        <w:t xml:space="preserve">Перейдите в браузере по адресу </w:t>
-      </w:r>
-      <w:r>
-        <w:rPr>
-          <w:b/>
-          <w:color w:val="6C63FF"/>
-        </w:rPr>
-        <w:t>https://hfr-alex-font.loca.lt/api/stats/dashboard</w:t>
-      </w:r>
-      <w:r>
-        <w:t xml:space="preserve"> (или локально на </w:t>
-      </w:r>
-      <w:r>
-        <w:rPr>
-          <w:b/>
-        </w:rPr>
-        <w:t>http://localhost:8000/api/stats/dashboard</w:t>
-      </w:r>
-      <w:r>
-        <w:t>). Вы увидите стильный современный веб-дашборд с темной темой.</w:t>
+        <w:t>Способ Б. Интерактивный веб-дашборд: Перейдите в браузере по адресу https://hfr-alex-font-v2.loca.lt/api/stats/dashboard (или локально на http://localhost:8000/api/stats/dashboard). Вы увидите стильный современный веб-дашборд с темной темой.</w:t>
       </w:r>
     </w:p>
     <w:p>
       <w:pPr>
-        <w:pStyle w:val="Heading2"/>
-        <w:keepNext/>
-        <w:spacing w:before="240" w:after="120"/>
+        <w:spacing w:after="80" w:line="276" w:lineRule="auto"/>
       </w:pPr>
       <w:r>
-        <w:rPr>
-          <w:rFonts w:ascii="Segoe UI" w:hAnsi="Segoe UI"/>
-          <w:color w:val="45475A"/>
-          <w:sz w:val="28"/>
-        </w:rPr>
         <w:t>Какие показатели отслеживаются:</w:t>
       </w:r>
     </w:p>
     <w:p>
       <w:pPr>
-        <w:spacing w:after="120"/>
+        <w:spacing w:after="80" w:line="276" w:lineRule="auto"/>
         <w:ind w:left="360"/>
+      </w:pPr>
+      <w:r>
+        <w:t>📈  Уникальные визиты сайта: Учитываются визиты по IP-адресам. Реализован интеллектуальный фильтр: повторные заходы или фоновые проверки бэкенда в течение 30 минут с одного IP группируются и не засчитываются как новые визиты.</w:t>
+      </w:r>
+    </w:p>
+    <w:p>
+      <w:pPr>
+        <w:spacing w:after="80" w:line="276" w:lineRule="auto"/>
+        <w:ind w:left="360"/>
+      </w:pPr>
+      <w:r>
+        <w:t>📈  Запущенные подборы шрифтов: Фиксируется общее количество проведенных поисков по картинкам, включая информацию о выбранном стилевом фильтре (Serif, Sans, Mono и др.) и самом популярном найденном шрифте.</w:t>
+      </w:r>
+    </w:p>
+    <w:p>
+      <w:pPr>
+        <w:spacing w:after="80" w:line="276" w:lineRule="auto"/>
+        <w:ind w:left="360"/>
+      </w:pPr>
+      <w:r>
+        <w:t>📈  Загрузки шрифтов: Логируется количество нажатий на кнопки «Скачать шрифт» с фиксацией ID и имени скачанного файла.</w:t>
+      </w:r>
+    </w:p>
+    <w:p>
+      <w:pPr>
+        <w:spacing w:after="80" w:line="276" w:lineRule="auto"/>
+        <w:ind w:left="360"/>
+      </w:pPr>
+      <w:r>
+        <w:t>📈  Топ-10 популярных совпадений: Рейтинг шрифтов, которые чаще всего оказывались на первом месте по результатам распознавания нейросетью.</w:t>
+      </w:r>
+    </w:p>
+    <w:p>
+      <w:pPr>
+        <w:spacing w:after="80" w:line="276" w:lineRule="auto"/>
+        <w:ind w:left="360"/>
+      </w:pPr>
+      <w:r>
+        <w:t>📈  Топ-10 скачиваемых шрифтов: Рейтинг шрифтов, которые пользователи чаще всего сохраняли на диск.</w:t>
+      </w:r>
+    </w:p>
+    <w:p>
+      <w:pPr>
+        <w:spacing w:after="80" w:line="276" w:lineRule="auto"/>
+        <w:ind w:left="360"/>
+      </w:pPr>
+      <w:r>
+        <w:t>📈  14-дневный график активности: Визуальная столбчатая диаграмма, показывающая соотношение визитов, подборов и скачиваний за последние 2 недели.</w:t>
+      </w:r>
+    </w:p>
+    <w:p>
+      <w:pPr>
+        <w:spacing w:before="120" w:after="240"/>
       </w:pPr>
       <w:r>
         <w:rPr>
           <w:b/>
+          <w:color w:val="003366"/>
+          <w:sz w:val="32"/>
         </w:rPr>
-        <w:t xml:space="preserve">📈  Уникальные визиты сайта: </w:t>
-      </w:r>
-      <w:r>
-        <w:t>Учитываются визиты по IP-адресам. Реализован интеллектуальный фильтр: повторные заходы или фоновые проверки бэкенда в течение 30 минут с одного IP группируются и не засчитываются как новые визиты.</w:t>
+        <w:t>5. Управление коллекцией шрифтов (Добавление и очистка)</w:t>
       </w:r>
     </w:p>
     <w:p>
       <w:pPr>
-        <w:spacing w:after="120"/>
-        <w:ind w:left="360"/>
+        <w:spacing w:after="80" w:line="276" w:lineRule="auto"/>
       </w:pPr>
-      <w:r>
-        <w:rPr>
-          <w:b/>
-        </w:rPr>
-        <w:t xml:space="preserve">📈  Запущенные подборы шрифтов: </w:t>
-      </w:r>
-      <w:r>
-        <w:t>Фиксируется общее количество проведенных поисков по картинкам, включая информацию о выбранном стилевом фильтре (Serif, Sans, Mono и др.) и самом популярном найденном шрифте.</w:t>
-      </w:r>
-    </w:p>
-    <w:p>
-      <w:pPr>
-        <w:spacing w:after="120"/>
-        <w:ind w:left="360"/>
-      </w:pPr>
-      <w:r>
-        <w:rPr>
-          <w:b/>
-        </w:rPr>
-        <w:t xml:space="preserve">📈  Загрузки шрифтов: </w:t>
-      </w:r>
-      <w:r>
-        <w:t>Логируется количество нажатий на кнопки «Скачать шрифт» с фиксацией ID и имени скачанного файла.</w:t>
-      </w:r>
-    </w:p>
-    <w:p>
-      <w:pPr>
-        <w:spacing w:after="120"/>
-        <w:ind w:left="360"/>
-      </w:pPr>
-      <w:r>
-        <w:rPr>
-          <w:b/>
-        </w:rPr>
-        <w:t xml:space="preserve">📈  Топ-10 популярных совпадений: </w:t>
-      </w:r>
-      <w:r>
-        <w:t>Рейтинг шрифтов, которые чаще всего оказывались на первом месте по результатам распознавания нейросетью.</w:t>
-      </w:r>
-    </w:p>
-    <w:p>
-      <w:pPr>
-        <w:spacing w:after="120"/>
-        <w:ind w:left="360"/>
-      </w:pPr>
-      <w:r>
-        <w:rPr>
-          <w:b/>
-        </w:rPr>
-        <w:t xml:space="preserve">📈  Топ-10 скачиваемых шрифтов: </w:t>
-      </w:r>
-      <w:r>
-        <w:t>Рейтинг шрифтов, которые пользователи чаще всего сохраняли на диск.</w:t>
-      </w:r>
-    </w:p>
-    <w:p>
-      <w:pPr>
-        <w:spacing w:after="120"/>
-        <w:ind w:left="360"/>
-      </w:pPr>
-      <w:r>
-        <w:rPr>
-          <w:b/>
-        </w:rPr>
-        <w:t xml:space="preserve">📈  14-дневный график активности: </w:t>
-      </w:r>
-      <w:r>
-        <w:t>Визуальная столбчатая диаграмма, показывающая соотношение визитов, подборов и скачиваний за последние 2 недели.</w:t>
-      </w:r>
-    </w:p>
-    <w:p>
-      <w:pPr>
-        <w:spacing w:after="240"/>
-      </w:pPr>
-    </w:p>
-    <w:p>
-      <w:r>
-        <w:t>5. Управление коллекцией шрифтов (Добавление и очистка)</w:t>
-      </w:r>
-    </w:p>
-    <w:p>
       <w:r>
         <w:t>В проект встроен интерактивный менеджер для работы с коллекцией шрифтов. Он позволяет легко очищать базу от демонстрационных/триальных версий, импортировать новые шрифты с ПК без дубликатов и автоматически пересобирать векторный FAISS-индекс.</w:t>
       </w:r>
     </w:p>
     <w:p>
-      <w:r/>
-    </w:p>
-    <w:p>
+      <w:pPr>
+        <w:spacing w:after="80" w:line="276" w:lineRule="auto"/>
+      </w:pPr>
       <w:r>
         <w:t>Как запустить менеджер:</w:t>
       </w:r>
     </w:p>
     <w:p>
+      <w:pPr>
+        <w:spacing w:after="80" w:line="276" w:lineRule="auto"/>
+      </w:pPr>
       <w:r>
         <w:t>Запустите файл manage_collection.bat в корневой папке проекта. Откроется текстовое меню со следующими возможностями:</w:t>
       </w:r>
     </w:p>
     <w:p>
-      <w:r/>
-    </w:p>
-    <w:p>
+      <w:pPr>
+        <w:keepNext/>
+        <w:spacing w:before="320" w:after="160"/>
+      </w:pPr>
       <w:r>
+        <w:rPr>
+          <w:b/>
+          <w:color w:val="0066CC"/>
+          <w:sz w:val="26"/>
+        </w:rPr>
         <w:t>1. Найти и удалить демо/триал шрифты (Очистка):</w:t>
       </w:r>
     </w:p>
     <w:p>
+      <w:pPr>
+        <w:spacing w:after="80" w:line="276" w:lineRule="auto"/>
+      </w:pPr>
       <w:r>
         <w:t>Скрипт автоматически сканирует все папки со шрифтами (All fonts..., Fonts CYR, fonts_db) на наличие в названии файлов ключевых слов (trial, demo, free-version, watermark, sample и др.). Вы сможете удалить все найденные триальные файлы разом или выбрать конкретные номера для удаления.</w:t>
       </w:r>
     </w:p>
     <w:p>
-      <w:r/>
-    </w:p>
-    <w:p>
+      <w:pPr>
+        <w:keepNext/>
+        <w:spacing w:before="320" w:after="160"/>
+      </w:pPr>
       <w:r>
+        <w:rPr>
+          <w:b/>
+          <w:color w:val="0066CC"/>
+          <w:sz w:val="26"/>
+        </w:rPr>
         <w:t>2. Импортировать новые шрифты из внешней папки:</w:t>
       </w:r>
     </w:p>
     <w:p>
+      <w:pPr>
+        <w:spacing w:after="80" w:line="276" w:lineRule="auto"/>
+      </w:pPr>
       <w:r>
         <w:t>Введите путь к папке с новыми шрифтами на вашем ПК. Скрипт рекурсивно найдет все файлы .ttf / .otf, проверит их MD5-хэши во избежание дубликатов и скопирует только уникальные файлы в папку проекта: fonts_db/imported_fonts.</w:t>
       </w:r>
     </w:p>
     <w:p>
-      <w:r/>
-    </w:p>
-    <w:p>
+      <w:pPr>
+        <w:keepNext/>
+        <w:spacing w:before="320" w:after="160"/>
+      </w:pPr>
       <w:r>
+        <w:rPr>
+          <w:b/>
+          <w:color w:val="0066CC"/>
+          <w:sz w:val="26"/>
+        </w:rPr>
         <w:t>3. Пересобрать векторную базу данных (FAISS):</w:t>
       </w:r>
     </w:p>
     <w:p>
+      <w:pPr>
+        <w:spacing w:after="80" w:line="276" w:lineRule="auto"/>
+      </w:pPr>
       <w:r>
         <w:t>После добавления или удаления файлов запустите этот пункт. Скрипт автоматически обновит data/fonts_index.json, прогонит новые шрифты через нейросеть HFRNet (используя CUDA на вашей RTX 3090) и перезапишет индекс data/font_signatures.faiss.</w:t>
       </w:r>
     </w:p>
     <w:p>
+      <w:pPr>
+        <w:spacing w:after="80" w:line="276" w:lineRule="auto"/>
+      </w:pPr>
       <w:r>
         <w:t>Для применения изменений на сайте перезапустите бэкенд (start_github.bat / start_local.bat).</w:t>
       </w:r>
     </w:p>
     <w:p>
-      <w:r/>
-    </w:p>
-    <w:p>
       <w:pPr>
-        <w:pStyle w:val="Heading1"/>
-        <w:keepNext/>
-        <w:spacing w:before="240" w:after="120"/>
+        <w:spacing w:before="120" w:after="240"/>
       </w:pPr>
       <w:r>
+        <w:rPr>
+          <w:b/>
+          <w:color w:val="003366"/>
+          <w:sz w:val="32"/>
+        </w:rPr>
         <w:t>6. Возможные проблемы и решения</w:t>
       </w:r>
     </w:p>
     <w:tbl>
       <w:tblPr>
-        <w:tblStyle w:val="LightShading-Accent1"/>
+        <w:tblStyle w:val="TableGrid"/>
         <w:tblW w:type="auto" w:w="0"/>
         <w:tblLook w:firstColumn="1" w:firstRow="1" w:lastColumn="0" w:lastRow="0" w:noHBand="0" w:noVBand="1" w:val="04A0"/>
       </w:tblPr>
       <w:tblGrid>
-        <w:gridCol w:w="4680"/>
-        <w:gridCol w:w="4680"/>
+        <w:gridCol w:w="5040"/>
+        <w:gridCol w:w="5040"/>
       </w:tblGrid>
       <w:tr>
         <w:tc>
           <w:tcPr>
-            <w:tcW w:type="dxa" w:w="4680"/>
-            <w:shd w:fill="45475A"/>
+            <w:tcW w:type="dxa" w:w="3600"/>
           </w:tcPr>
           <w:p>
+            <w:pPr>
+              <w:spacing w:before="80" w:after="80"/>
+            </w:pPr>
             <w:r>
               <w:rPr>
                 <w:b/>
-                <w:color w:val="FFFFFF"/>
+                <w:sz w:val="22"/>
               </w:rPr>
               <w:t>Проблема / Ошибка</w:t>
             </w:r>
@@ -748,14 +814,16 @@
         </w:tc>
         <w:tc>
           <w:tcPr>
-            <w:tcW w:type="dxa" w:w="4680"/>
-            <w:shd w:fill="45475A"/>
+            <w:tcW w:type="dxa" w:w="6480"/>
           </w:tcPr>
           <w:p>
+            <w:pPr>
+              <w:spacing w:before="80" w:after="80"/>
+            </w:pPr>
             <w:r>
               <w:rPr>
                 <w:b/>
-                <w:color w:val="FFFFFF"/>
+                <w:sz w:val="22"/>
               </w:rPr>
               <w:t>Способ решения</w:t>
             </w:r>
@@ -765,24 +833,27 @@
       <w:tr>
         <w:tc>
           <w:tcPr>
-            <w:tcW w:type="dxa" w:w="4680"/>
+            <w:tcW w:type="dxa" w:w="3600"/>
           </w:tcPr>
           <w:p>
+            <w:pPr>
+              <w:spacing w:before="80" w:after="80" w:line="276" w:lineRule="auto"/>
+            </w:pPr>
             <w:r>
-              <w:rPr>
-                <w:b/>
-              </w:rPr>
               <w:t>Сайт пишет «Нет связи» или статус горит красным</w:t>
             </w:r>
           </w:p>
         </w:tc>
         <w:tc>
           <w:tcPr>
-            <w:tcW w:type="dxa" w:w="4680"/>
+            <w:tcW w:type="dxa" w:w="6480"/>
           </w:tcPr>
           <w:p>
+            <w:pPr>
+              <w:spacing w:before="80" w:after="80" w:line="276" w:lineRule="auto"/>
+            </w:pPr>
             <w:r>
-              <w:t>Проверить, запущена ли консоль start_github.bat (или start_local.bat). Убедитесь, что бэкенд и туннель запущены успешно. В случае работы с GitHub Pages, если автонастройка не сработала, скопируйте ссылку туннеля из буфера обмена, откройте «Настройки API» в боковой панели сайта (доступны при логине под admin-email) и вставьте её туда вручную.</w:t>
+              <w:t>Проверьте, запущена ли консоль start_github.bat (или start_local.bat). Убедитесь, что бэкенд и туннель запущены успешно. В случае работы с GitHub Pages, если автонастройка не сработала, скопируйте ссылку туннеля из буфера обмена, откройте «Настройки API» в боковой панели сайта (доступны при логине под admin-email) и вставьте её туда вручную.</w:t>
             </w:r>
           </w:p>
         </w:tc>
@@ -790,21 +861,27 @@
       <w:tr>
         <w:tc>
           <w:tcPr>
-            <w:tcW w:type="dxa" w:w="4680"/>
+            <w:tcW w:type="dxa" w:w="3600"/>
           </w:tcPr>
           <w:p>
+            <w:pPr>
+              <w:spacing w:before="80" w:after="80" w:line="276" w:lineRule="auto"/>
+            </w:pPr>
             <w:r>
-              <w:t>Туннель Cloudflare не запускается (ошибки DNS/QUIC)</w:t>
+              <w:t>Cloudflare туннель (trycloudflare) не подключается или пишет "Failed to Fetch" на мобильном</w:t>
             </w:r>
           </w:p>
         </w:tc>
         <w:tc>
           <w:tcPr>
-            <w:tcW w:type="dxa" w:w="4680"/>
+            <w:tcW w:type="dxa" w:w="6480"/>
           </w:tcPr>
           <w:p>
+            <w:pPr>
+              <w:spacing w:before="80" w:after="80" w:line="276" w:lineRule="auto"/>
+            </w:pPr>
             <w:r>
-              <w:t>Для стабильного соединения используйте туннель Cloudflare через start_github.bat, он работает быстрее и надежнее других способов.</w:t>
+              <w:t>Российские провайдеры блокируют и режут трафик к trycloudflare.com. Для работы на телефоне используйте start_mobile_local.bat (если телефон подключен к тому же Wi-Fi) или start_pinggy.bat (для работы через мобильный интернет).</w:t>
             </w:r>
           </w:p>
         </w:tc>
@@ -812,22 +889,53 @@
       <w:tr>
         <w:tc>
           <w:tcPr>
-            <w:tcW w:type="dxa" w:w="4680"/>
+            <w:tcW w:type="dxa" w:w="3600"/>
           </w:tcPr>
           <w:p>
+            <w:pPr>
+              <w:spacing w:before="80" w:after="80" w:line="276" w:lineRule="auto"/>
+            </w:pPr>
             <w:r>
-              <w:rPr>
-                <w:b/>
-              </w:rPr>
+              <w:t>Localtunnel долго грузится или не запускается</w:t>
+            </w:r>
+          </w:p>
+        </w:tc>
+        <w:tc>
+          <w:tcPr>
+            <w:tcW w:type="dxa" w:w="6480"/>
+          </w:tcPr>
+          <w:p>
+            <w:pPr>
+              <w:spacing w:before="80" w:after="80" w:line="276" w:lineRule="auto"/>
+            </w:pPr>
+            <w:r>
+              <w:t>Используйте start_pinggy.bat или start_mobile_local.bat для быстрой и надежной работы.</w:t>
+            </w:r>
+          </w:p>
+        </w:tc>
+      </w:tr>
+      <w:tr>
+        <w:tc>
+          <w:tcPr>
+            <w:tcW w:type="dxa" w:w="3600"/>
+          </w:tcPr>
+          <w:p>
+            <w:pPr>
+              <w:spacing w:before="80" w:after="80" w:line="276" w:lineRule="auto"/>
+            </w:pPr>
+            <w:r>
               <w:t>Не распознаются символы на изображении</w:t>
             </w:r>
           </w:p>
         </w:tc>
         <w:tc>
           <w:tcPr>
-            <w:tcW w:type="dxa" w:w="4680"/>
+            <w:tcW w:type="dxa" w:w="6480"/>
           </w:tcPr>
           <w:p>
+            <w:pPr>
+              <w:spacing w:before="80" w:after="80" w:line="276" w:lineRule="auto"/>
+            </w:pPr>
             <w:r>
               <w:t>Убедитесь, что текст на скриншоте достаточно четкий, буквы не слипаются и имеют стандартное начертание. Для лучшего качества используйте скриншоты с контрастными цветами.</w:t>
             </w:r>
@@ -837,7 +945,7 @@
     </w:tbl>
     <w:sectPr>
       <w:pgSz w:w="12240" w:h="15840"/>
-      <w:pgMar w:top="1440" w:right="1440" w:bottom="1440" w:left="1440" w:header="720" w:footer="720" w:gutter="0"/>
+      <w:pgMar w:top="1080" w:right="1080" w:bottom="1080" w:left="1080" w:header="720" w:footer="720" w:gutter="0"/>
       <w:cols w:space="720"/>
       <w:docGrid w:linePitch="360"/>
     </w:sectPr>
@@ -1209,9 +1317,8 @@
     <w:qFormat/>
     <w:rsid w:val="00FC693F"/>
     <w:rPr>
-      <w:rFonts w:ascii="Segoe UI" w:hAnsi="Segoe UI"/>
-      <w:color w:val="11111B"/>
-      <w:sz w:val="22"/>
+      <w:rFonts w:ascii="Arial" w:hAnsi="Arial"/>
+      <w:sz w:val="21"/>
     </w:rPr>
   </w:style>
   <w:style w:type="paragraph" w:styleId="Header">

</xml_diff>